<commit_message>
TTE ELT Marzo imprimir
</commit_message>
<xml_diff>
--- a/PDC_2025_3ro_TTG.docx
+++ b/PDC_2025_3ro_TTG.docx
@@ -705,6 +705,12 @@
                 <w:rFonts w:cstheme="minorHAnsi"/>
               </w:rPr>
             </w:pPr>
+            <w:r>
+              <w:rPr>
+                <w:rFonts w:cstheme="minorHAnsi"/>
+              </w:rPr>
+              <w:t>TTE Electricidad Industrial</w:t>
+            </w:r>
           </w:p>
         </w:tc>
       </w:tr>
@@ -811,6 +817,12 @@
                 <w:rFonts w:cstheme="minorHAnsi"/>
               </w:rPr>
             </w:pPr>
+            <w:r>
+              <w:rPr>
+                <w:rFonts w:cstheme="minorHAnsi"/>
+              </w:rPr>
+              <w:t>Marzo</w:t>
+            </w:r>
           </w:p>
         </w:tc>
       </w:tr>
@@ -1424,46 +1436,114 @@
           <w:p>
             <w:pPr>
               <w:pStyle w:val="Sinespaciado"/>
-              <w:spacing w:line="276" w:lineRule="auto"/>
-              <w:rPr>
-                <w:rFonts w:cstheme="minorHAnsi"/>
-              </w:rPr>
-            </w:pPr>
-            <w:r>
-              <w:rPr>
-                <w:rFonts w:cstheme="minorHAnsi"/>
-              </w:rPr>
-              <w:t>Planificar desde su área actividad</w:t>
-            </w:r>
-            <w:r>
-              <w:rPr>
-                <w:rFonts w:cstheme="minorHAnsi"/>
-              </w:rPr>
-              <w:t>es</w:t>
-            </w:r>
-            <w:r>
-              <w:rPr>
-                <w:rFonts w:cstheme="minorHAnsi"/>
-              </w:rPr>
-              <w:t xml:space="preserve"> que ayude a consolidar el proyecto socio comunitario productivo en </w:t>
-            </w:r>
-            <w:r>
-              <w:rPr>
-                <w:rFonts w:cstheme="minorHAnsi"/>
-              </w:rPr>
-              <w:t>el desarrollo de sus clases</w:t>
-            </w:r>
-          </w:p>
-          <w:p>
-            <w:pPr>
-              <w:pStyle w:val="Sinespaciado"/>
-              <w:spacing w:line="276" w:lineRule="auto"/>
-              <w:rPr>
-                <w:rFonts w:cstheme="minorHAnsi"/>
-                <w:b/>
-                <w:bCs/>
-              </w:rPr>
-            </w:pPr>
+              <w:rPr>
+                <w:rFonts w:cstheme="minorHAnsi"/>
+                <w:b/>
+                <w:bCs/>
+              </w:rPr>
+            </w:pPr>
+            <w:r>
+              <w:rPr>
+                <w:rFonts w:cstheme="minorHAnsi"/>
+              </w:rPr>
+              <w:t>Taller de reflexión a</w:t>
+            </w:r>
+            <w:r>
+              <w:rPr>
+                <w:rFonts w:cstheme="minorHAnsi"/>
+              </w:rPr>
+              <w:t xml:space="preserve"> </w:t>
+            </w:r>
+            <w:r>
+              <w:rPr>
+                <w:rFonts w:cstheme="minorHAnsi"/>
+              </w:rPr>
+              <w:t>los padres de familia</w:t>
+            </w:r>
+            <w:r>
+              <w:rPr>
+                <w:rFonts w:cstheme="minorHAnsi"/>
+              </w:rPr>
+              <w:t xml:space="preserve"> </w:t>
+            </w:r>
+            <w:r>
+              <w:rPr>
+                <w:rFonts w:cstheme="minorHAnsi"/>
+              </w:rPr>
+              <w:t>sobre el mal uso de</w:t>
+            </w:r>
+            <w:r>
+              <w:rPr>
+                <w:rFonts w:cstheme="minorHAnsi"/>
+              </w:rPr>
+              <w:t xml:space="preserve"> </w:t>
+            </w:r>
+            <w:r>
+              <w:rPr>
+                <w:rFonts w:cstheme="minorHAnsi"/>
+              </w:rPr>
+              <w:t>las redes sociales y</w:t>
+            </w:r>
+            <w:r>
+              <w:rPr>
+                <w:rFonts w:cstheme="minorHAnsi"/>
+              </w:rPr>
+              <w:t xml:space="preserve"> </w:t>
+            </w:r>
+            <w:r>
+              <w:rPr>
+                <w:rFonts w:cstheme="minorHAnsi"/>
+              </w:rPr>
+              <w:t>el consumo del</w:t>
+            </w:r>
+            <w:r>
+              <w:rPr>
+                <w:rFonts w:cstheme="minorHAnsi"/>
+              </w:rPr>
+              <w:t xml:space="preserve"> </w:t>
+            </w:r>
+            <w:r>
+              <w:rPr>
+                <w:rFonts w:cstheme="minorHAnsi"/>
+              </w:rPr>
+              <w:t>alcohol</w:t>
+            </w:r>
+            <w:r>
+              <w:rPr>
+                <w:rFonts w:cstheme="minorHAnsi"/>
+              </w:rPr>
+              <w:t xml:space="preserve"> </w:t>
+            </w:r>
+            <w:r>
+              <w:rPr>
+                <w:rFonts w:cstheme="minorHAnsi"/>
+              </w:rPr>
+              <w:t>“fortaleciendo las</w:t>
+            </w:r>
+            <w:r>
+              <w:rPr>
+                <w:rFonts w:cstheme="minorHAnsi"/>
+              </w:rPr>
+              <w:t xml:space="preserve"> </w:t>
+            </w:r>
+            <w:r>
+              <w:rPr>
+                <w:rFonts w:cstheme="minorHAnsi"/>
+              </w:rPr>
+              <w:t>relaciones en la</w:t>
+            </w:r>
+            <w:r>
+              <w:rPr>
+                <w:rFonts w:cstheme="minorHAnsi"/>
+              </w:rPr>
+              <w:t xml:space="preserve"> </w:t>
+            </w:r>
+            <w:r>
+              <w:rPr>
+                <w:rFonts w:cstheme="minorHAnsi"/>
+              </w:rPr>
+              <w:t>familia”.</w:t>
+            </w:r>
           </w:p>
         </w:tc>
         <w:tc>
@@ -1485,31 +1565,7 @@
               <w:rPr>
                 <w:rFonts w:cstheme="minorHAnsi"/>
               </w:rPr>
-              <w:t xml:space="preserve">Incluir en su </w:t>
-            </w:r>
-            <w:r>
-              <w:rPr>
-                <w:rFonts w:cstheme="minorHAnsi"/>
-              </w:rPr>
-              <w:t>área actividad</w:t>
-            </w:r>
-            <w:r>
-              <w:rPr>
-                <w:rFonts w:cstheme="minorHAnsi"/>
-              </w:rPr>
-              <w:t>es</w:t>
-            </w:r>
-            <w:r>
-              <w:rPr>
-                <w:rFonts w:cstheme="minorHAnsi"/>
-              </w:rPr>
-              <w:t xml:space="preserve"> que </w:t>
-            </w:r>
-            <w:r>
-              <w:rPr>
-                <w:rFonts w:cstheme="minorHAnsi"/>
-              </w:rPr>
-              <w:t xml:space="preserve">promuevan la convivencia pacífica y armónica en el desarrollo de sus clases </w:t>
+              <w:t>Realización de cuestionario sobre el tema.</w:t>
             </w:r>
           </w:p>
           <w:p>
@@ -1534,26 +1590,17 @@
             <w:pPr>
               <w:pStyle w:val="Sinespaciado"/>
               <w:spacing w:line="276" w:lineRule="auto"/>
-              <w:rPr>
-                <w:rFonts w:cstheme="minorHAnsi"/>
-              </w:rPr>
-            </w:pPr>
-            <w:r>
-              <w:rPr>
-                <w:rFonts w:cstheme="minorHAnsi"/>
-              </w:rPr>
-              <w:t>Explicar con que actividades promovemos la lectura comprensiva en las y los estudiantes desde el trabajo de mi área</w:t>
-            </w:r>
-          </w:p>
-          <w:p>
-            <w:pPr>
-              <w:pStyle w:val="Sinespaciado"/>
-              <w:spacing w:line="276" w:lineRule="auto"/>
               <w:jc w:val="both"/>
               <w:rPr>
                 <w:rFonts w:cstheme="minorHAnsi"/>
               </w:rPr>
             </w:pPr>
+            <w:r>
+              <w:rPr>
+                <w:rFonts w:cstheme="minorHAnsi"/>
+              </w:rPr>
+              <w:t>Lectura del libro “El sueño de la inteligencia artificial”</w:t>
+            </w:r>
           </w:p>
         </w:tc>
       </w:tr>
@@ -1707,6 +1754,12 @@
                 <w:rFonts w:cstheme="minorHAnsi"/>
               </w:rPr>
             </w:pPr>
+            <w:r>
+              <w:rPr>
+                <w:rFonts w:cstheme="minorHAnsi"/>
+              </w:rPr>
+              <w:t>4º</w:t>
+            </w:r>
           </w:p>
         </w:tc>
         <w:tc>
@@ -1751,6 +1804,12 @@
                 <w:rFonts w:cstheme="minorHAnsi"/>
               </w:rPr>
             </w:pPr>
+            <w:r>
+              <w:rPr>
+                <w:rFonts w:cstheme="minorHAnsi"/>
+              </w:rPr>
+              <w:t>A, B, C y D</w:t>
+            </w:r>
           </w:p>
         </w:tc>
       </w:tr>
@@ -1805,6 +1864,67 @@
           </w:tcPr>
           <w:p>
             <w:pPr>
+              <w:spacing w:after="0" w:line="240" w:lineRule="auto"/>
+              <w:rPr>
+                <w:rFonts w:eastAsia="Times New Roman"/>
+                <w:lang w:eastAsia="es-419"/>
+              </w:rPr>
+            </w:pPr>
+            <w:r>
+              <w:rPr>
+                <w:rStyle w:val="fontstyle01"/>
+              </w:rPr>
+              <w:t>Fortalecemos la responsabilidad, solidaridad y complementariedad, a través del estudio de l</w:t>
+            </w:r>
+            <w:r>
+              <w:rPr>
+                <w:rStyle w:val="fontstyle01"/>
+              </w:rPr>
+              <w:t>as normas de seguridad ISO</w:t>
+            </w:r>
+            <w:r>
+              <w:rPr>
+                <w:rStyle w:val="fontstyle01"/>
+              </w:rPr>
+              <w:t>, elaborando</w:t>
+            </w:r>
+            <w:r>
+              <w:rPr>
+                <w:rFonts w:ascii="Calibri" w:hAnsi="Calibri" w:cs="Calibri"/>
+                <w:color w:val="000000"/>
+              </w:rPr>
+              <w:br/>
+            </w:r>
+            <w:r>
+              <w:rPr>
+                <w:rStyle w:val="fontstyle01"/>
+              </w:rPr>
+              <w:t>un cuestionario de seguridad en el taller</w:t>
+            </w:r>
+            <w:r>
+              <w:rPr>
+                <w:rStyle w:val="fontstyle01"/>
+              </w:rPr>
+              <w:t>, para preservar la vida del ser humano y madre tierra</w:t>
+            </w:r>
+            <w:r>
+              <w:rPr>
+                <w:rStyle w:val="fontstyle01"/>
+              </w:rPr>
+              <w:t>.</w:t>
+            </w:r>
+          </w:p>
+          <w:p>
+            <w:pPr>
+              <w:spacing w:after="0" w:line="240" w:lineRule="auto"/>
+              <w:rPr>
+                <w:rFonts w:eastAsia="Times New Roman"/>
+                <w:lang w:eastAsia="es-419"/>
+              </w:rPr>
+            </w:pPr>
+          </w:p>
+          <w:p>
+            <w:pPr>
               <w:tabs>
                 <w:tab w:val="left" w:pos="210"/>
               </w:tabs>
@@ -1813,13 +1933,6 @@
                 <w:bCs/>
               </w:rPr>
             </w:pPr>
-            <w:r>
-              <w:rPr>
-                <w:rFonts w:cstheme="minorHAnsi"/>
-                <w:bCs/>
-              </w:rPr>
-              <w:t xml:space="preserve">(Elaborar el objetivo holístico del mes en relación al Objetivo Holístico de Secundaria – de trimestre y al Proyecto Sociocomunitario Productivo) </w:t>
-            </w:r>
           </w:p>
         </w:tc>
       </w:tr>
@@ -1880,21 +1993,28 @@
                 <w:rFonts w:cstheme="minorHAnsi"/>
                 <w:bCs/>
               </w:rPr>
-              <w:t xml:space="preserve">(Los perfiles de salida están establecidos en los planes y programas; de ahí elija uno o </w:t>
-            </w:r>
-            <w:r>
-              <w:rPr>
-                <w:rFonts w:cstheme="minorHAnsi"/>
-                <w:bCs/>
-              </w:rPr>
-              <w:t xml:space="preserve">dos </w:t>
-            </w:r>
-            <w:r>
-              <w:rPr>
-                <w:rFonts w:cstheme="minorHAnsi"/>
-                <w:bCs/>
-              </w:rPr>
-              <w:t xml:space="preserve">que tengan relación con los temas planteados en los contenidos y que correspondan al primer trimestre de su área de saberes y conocimientos) </w:t>
+              <w:t xml:space="preserve">Reconoce las </w:t>
+            </w:r>
+            <w:r>
+              <w:rPr>
+                <w:rFonts w:cstheme="minorHAnsi"/>
+                <w:bCs/>
+              </w:rPr>
+              <w:t>normas de seguridad y salud laboral</w:t>
+            </w:r>
+            <w:r>
+              <w:rPr>
+                <w:rFonts w:cstheme="minorHAnsi"/>
+                <w:bCs/>
+              </w:rPr>
+              <w:t>, respetando el orden y la seguridad industrial dentro del taller</w:t>
+            </w:r>
+            <w:r>
+              <w:rPr>
+                <w:rFonts w:cstheme="minorHAnsi"/>
+                <w:bCs/>
+              </w:rPr>
+              <w:t>.</w:t>
             </w:r>
           </w:p>
         </w:tc>
@@ -1967,6 +2087,76 @@
           </w:tcPr>
           <w:p>
             <w:pPr>
+              <w:jc w:val="both"/>
+              <w:rPr>
+                <w:rFonts w:ascii="Arial" w:eastAsia="Arial" w:hAnsi="Arial" w:cs="Arial"/>
+                <w:b/>
+                <w:bCs/>
+                <w:sz w:val="20"/>
+                <w:szCs w:val="20"/>
+              </w:rPr>
+            </w:pPr>
+            <w:r>
+              <w:rPr>
+                <w:rFonts w:ascii="Arial" w:eastAsia="Arial" w:hAnsi="Arial" w:cs="Arial"/>
+                <w:b/>
+                <w:bCs/>
+                <w:sz w:val="20"/>
+                <w:szCs w:val="20"/>
+              </w:rPr>
+              <w:t>SEGURIDAD Y SALUD OCUPACIONAL</w:t>
+            </w:r>
+          </w:p>
+          <w:p>
+            <w:pPr>
+              <w:numPr>
+                <w:ilvl w:val="0"/>
+                <w:numId w:val="3"/>
+              </w:numPr>
+              <w:spacing w:after="0" w:line="240" w:lineRule="auto"/>
+              <w:ind w:left="141" w:hanging="150"/>
+              <w:jc w:val="both"/>
+              <w:rPr>
+                <w:rFonts w:ascii="Arial" w:eastAsia="Arial" w:hAnsi="Arial" w:cs="Arial"/>
+                <w:sz w:val="20"/>
+                <w:szCs w:val="20"/>
+              </w:rPr>
+            </w:pPr>
+            <w:r>
+              <w:rPr>
+                <w:rFonts w:ascii="Arial" w:eastAsia="Arial" w:hAnsi="Arial" w:cs="Arial"/>
+                <w:sz w:val="20"/>
+                <w:szCs w:val="20"/>
+              </w:rPr>
+              <w:t>Normas de seguridad industrial; ISO 45001</w:t>
+            </w:r>
+          </w:p>
+          <w:p>
+            <w:pPr>
+              <w:numPr>
+                <w:ilvl w:val="0"/>
+                <w:numId w:val="3"/>
+              </w:numPr>
+              <w:spacing w:after="0" w:line="240" w:lineRule="auto"/>
+              <w:ind w:left="141" w:hanging="150"/>
+              <w:jc w:val="both"/>
+              <w:rPr>
+                <w:rFonts w:ascii="Arial" w:eastAsia="Arial" w:hAnsi="Arial" w:cs="Arial"/>
+                <w:sz w:val="20"/>
+                <w:szCs w:val="20"/>
+              </w:rPr>
+            </w:pPr>
+            <w:r>
+              <w:rPr>
+                <w:rFonts w:ascii="Arial" w:eastAsia="Arial" w:hAnsi="Arial" w:cs="Arial"/>
+                <w:sz w:val="20"/>
+                <w:szCs w:val="20"/>
+              </w:rPr>
+              <w:t>Indumentaria e implementos, señalización, código de colores en seguridad industrial.</w:t>
+            </w:r>
+          </w:p>
+          <w:p>
+            <w:pPr>
               <w:tabs>
                 <w:tab w:val="left" w:pos="210"/>
               </w:tabs>
@@ -1975,13 +2165,6 @@
                 <w:bCs/>
               </w:rPr>
             </w:pPr>
-            <w:r>
-              <w:rPr>
-                <w:rFonts w:cstheme="minorHAnsi"/>
-                <w:bCs/>
-              </w:rPr>
-              <w:t>Seleccione los contenidos que considere pertinente desarrollar en el tiempo establecido en la planificación</w:t>
-            </w:r>
           </w:p>
           <w:p>
             <w:pPr>
@@ -2017,16 +2200,12 @@
               <w:rPr>
                 <w:rFonts w:cstheme="minorHAnsi"/>
               </w:rPr>
-              <w:t xml:space="preserve">Educación Intracultural, intercultural y plurilingüe </w:t>
-            </w:r>
-          </w:p>
-          <w:p>
-            <w:pPr>
-              <w:pStyle w:val="Sinespaciado"/>
-              <w:numPr>
-                <w:ilvl w:val="0"/>
-                <w:numId w:val="2"/>
-              </w:numPr>
+              <w:t>Educación para la producción</w:t>
+            </w:r>
+          </w:p>
+          <w:p>
+            <w:pPr>
+              <w:pStyle w:val="Sinespaciado"/>
               <w:spacing w:line="276" w:lineRule="auto"/>
               <w:rPr>
                 <w:rFonts w:cstheme="minorHAnsi"/>
@@ -2036,60 +2215,7 @@
               <w:rPr>
                 <w:rFonts w:cstheme="minorHAnsi"/>
               </w:rPr>
-              <w:t>Educación en Valores Sociocomunitarios</w:t>
-            </w:r>
-          </w:p>
-          <w:p>
-            <w:pPr>
-              <w:pStyle w:val="Sinespaciado"/>
-              <w:numPr>
-                <w:ilvl w:val="0"/>
-                <w:numId w:val="2"/>
-              </w:numPr>
-              <w:spacing w:line="276" w:lineRule="auto"/>
-              <w:rPr>
-                <w:rFonts w:cstheme="minorHAnsi"/>
-              </w:rPr>
-            </w:pPr>
-            <w:r>
-              <w:rPr>
-                <w:rFonts w:cstheme="minorHAnsi"/>
-              </w:rPr>
-              <w:t>Educación en Convivencia con la Madre Tierra y Salud Comunitaria</w:t>
-            </w:r>
-          </w:p>
-          <w:p>
-            <w:pPr>
-              <w:pStyle w:val="Sinespaciado"/>
-              <w:numPr>
-                <w:ilvl w:val="0"/>
-                <w:numId w:val="2"/>
-              </w:numPr>
-              <w:spacing w:line="276" w:lineRule="auto"/>
-              <w:rPr>
-                <w:rFonts w:cstheme="minorHAnsi"/>
-              </w:rPr>
-            </w:pPr>
-            <w:r>
-              <w:rPr>
-                <w:rFonts w:cstheme="minorHAnsi"/>
-              </w:rPr>
-              <w:t>Educación para la producción</w:t>
-            </w:r>
-          </w:p>
-          <w:p>
-            <w:pPr>
-              <w:pStyle w:val="Sinespaciado"/>
-              <w:spacing w:line="276" w:lineRule="auto"/>
-              <w:rPr>
-                <w:rFonts w:cstheme="minorHAnsi"/>
-              </w:rPr>
-            </w:pPr>
-            <w:r>
-              <w:rPr>
-                <w:rFonts w:cstheme="minorHAnsi"/>
-              </w:rPr>
-              <w:t>(Explicar que eje articulador aplica en su plan)</w:t>
+              <w:t>Usa las normas de seguridad en el taller para preservar la salud física.</w:t>
             </w:r>
           </w:p>
         </w:tc>
@@ -2144,14 +2270,14 @@
       <w:tblGrid>
         <w:gridCol w:w="2529"/>
         <w:gridCol w:w="4536"/>
-        <w:gridCol w:w="1798"/>
-        <w:gridCol w:w="1604"/>
+        <w:gridCol w:w="1559"/>
+        <w:gridCol w:w="1843"/>
         <w:gridCol w:w="3096"/>
       </w:tblGrid>
       <w:tr>
         <w:tc>
           <w:tcPr>
-            <w:tcW w:w="8863" w:type="dxa"/>
+            <w:tcW w:w="8624" w:type="dxa"/>
             <w:gridSpan w:val="3"/>
             <w:shd w:val="clear" w:color="auto" w:fill="B4C6E7" w:themeFill="accent1" w:themeFillTint="66"/>
           </w:tcPr>
@@ -2175,7 +2301,7 @@
         </w:tc>
         <w:tc>
           <w:tcPr>
-            <w:tcW w:w="4700" w:type="dxa"/>
+            <w:tcW w:w="4939" w:type="dxa"/>
             <w:gridSpan w:val="2"/>
             <w:shd w:val="clear" w:color="auto" w:fill="B4C6E7" w:themeFill="accent1" w:themeFillTint="66"/>
           </w:tcPr>
@@ -2218,7 +2344,7 @@
       <w:tr>
         <w:tc>
           <w:tcPr>
-            <w:tcW w:w="8863" w:type="dxa"/>
+            <w:tcW w:w="8624" w:type="dxa"/>
             <w:gridSpan w:val="3"/>
             <w:shd w:val="clear" w:color="auto" w:fill="FFFFFF" w:themeFill="background1"/>
           </w:tcPr>
@@ -2226,22 +2352,36 @@
             <w:pPr>
               <w:pStyle w:val="Sinespaciado"/>
               <w:rPr>
+                <w:rFonts w:eastAsiaTheme="minorHAnsi" w:cstheme="minorHAnsi"/>
+                <w:lang w:eastAsia="en-US"/>
+              </w:rPr>
+            </w:pPr>
+            <w:r>
+              <w:rPr>
                 <w:rFonts w:ascii="Berlin Sans FB Demi" w:eastAsiaTheme="minorHAnsi" w:hAnsi="Berlin Sans FB Demi"/>
                 <w:lang w:eastAsia="en-US"/>
               </w:rPr>
-            </w:pPr>
+              <w:t>PRACTICA:</w:t>
+            </w:r>
             <w:r>
               <w:rPr>
                 <w:rFonts w:ascii="Berlin Sans FB Demi" w:eastAsiaTheme="minorHAnsi" w:hAnsi="Berlin Sans FB Demi"/>
                 <w:lang w:eastAsia="en-US"/>
               </w:rPr>
-              <w:t>PRACTICA:</w:t>
-            </w:r>
-          </w:p>
-        </w:tc>
-        <w:tc>
-          <w:tcPr>
-            <w:tcW w:w="4700" w:type="dxa"/>
+              <w:t xml:space="preserve"> </w:t>
+            </w:r>
+            <w:r>
+              <w:rPr>
+                <w:rFonts w:eastAsiaTheme="minorHAnsi" w:cstheme="minorHAnsi"/>
+                <w:lang w:eastAsia="en-US"/>
+              </w:rPr>
+              <w:t xml:space="preserve"> Buscamos noticias de no cumplimiento de seguridad en el manejo de ELT. </w:t>
+            </w:r>
+          </w:p>
+        </w:tc>
+        <w:tc>
+          <w:tcPr>
+            <w:tcW w:w="4939" w:type="dxa"/>
             <w:gridSpan w:val="2"/>
             <w:shd w:val="clear" w:color="auto" w:fill="FFFFFF" w:themeFill="background1"/>
           </w:tcPr>
@@ -2249,16 +2389,23 @@
             <w:pPr>
               <w:pStyle w:val="Sinespaciado"/>
               <w:rPr>
+                <w:rFonts w:eastAsiaTheme="minorHAnsi" w:cstheme="minorHAnsi"/>
+                <w:lang w:eastAsia="en-US"/>
+              </w:rPr>
+            </w:pPr>
+            <w:r>
+              <w:rPr>
                 <w:rFonts w:ascii="Berlin Sans FB Demi" w:eastAsiaTheme="minorHAnsi" w:hAnsi="Berlin Sans FB Demi"/>
                 <w:lang w:eastAsia="en-US"/>
               </w:rPr>
-            </w:pPr>
-            <w:r>
-              <w:rPr>
-                <w:rFonts w:ascii="Berlin Sans FB Demi" w:eastAsiaTheme="minorHAnsi" w:hAnsi="Berlin Sans FB Demi"/>
-                <w:lang w:eastAsia="en-US"/>
-              </w:rPr>
               <w:t xml:space="preserve">SER: </w:t>
+            </w:r>
+            <w:r>
+              <w:rPr>
+                <w:rFonts w:eastAsiaTheme="minorHAnsi" w:cstheme="minorHAnsi"/>
+                <w:lang w:eastAsia="en-US"/>
+              </w:rPr>
+              <w:t>Respeto y participación en aula.</w:t>
             </w:r>
           </w:p>
         </w:tc>
@@ -2266,7 +2413,7 @@
       <w:tr>
         <w:tc>
           <w:tcPr>
-            <w:tcW w:w="8863" w:type="dxa"/>
+            <w:tcW w:w="8624" w:type="dxa"/>
             <w:gridSpan w:val="3"/>
             <w:shd w:val="clear" w:color="auto" w:fill="FFFFFF" w:themeFill="background1"/>
           </w:tcPr>
@@ -2274,22 +2421,36 @@
             <w:pPr>
               <w:pStyle w:val="Sinespaciado"/>
               <w:rPr>
+                <w:rFonts w:eastAsiaTheme="minorHAnsi" w:cstheme="minorHAnsi"/>
+                <w:lang w:eastAsia="en-US"/>
+              </w:rPr>
+            </w:pPr>
+            <w:r>
+              <w:rPr>
                 <w:rFonts w:ascii="Berlin Sans FB Demi" w:eastAsiaTheme="minorHAnsi" w:hAnsi="Berlin Sans FB Demi"/>
                 <w:lang w:eastAsia="en-US"/>
               </w:rPr>
-            </w:pPr>
-            <w:r>
-              <w:rPr>
-                <w:rFonts w:ascii="Berlin Sans FB Demi" w:eastAsiaTheme="minorHAnsi" w:hAnsi="Berlin Sans FB Demi"/>
-                <w:lang w:eastAsia="en-US"/>
-              </w:rPr>
               <w:t>TEORÍA:</w:t>
             </w:r>
-          </w:p>
-        </w:tc>
-        <w:tc>
-          <w:tcPr>
-            <w:tcW w:w="4700" w:type="dxa"/>
+            <w:r>
+              <w:rPr>
+                <w:rFonts w:eastAsiaTheme="minorHAnsi" w:cstheme="minorHAnsi"/>
+                <w:lang w:eastAsia="en-US"/>
+              </w:rPr>
+              <w:t xml:space="preserve"> </w:t>
+            </w:r>
+            <w:r>
+              <w:rPr>
+                <w:rFonts w:eastAsiaTheme="minorHAnsi" w:cstheme="minorHAnsi"/>
+                <w:lang w:eastAsia="en-US"/>
+              </w:rPr>
+              <w:t>Analizamos la norma de seguridad ISO 45001</w:t>
+            </w:r>
+          </w:p>
+        </w:tc>
+        <w:tc>
+          <w:tcPr>
+            <w:tcW w:w="4939" w:type="dxa"/>
             <w:gridSpan w:val="2"/>
             <w:shd w:val="clear" w:color="auto" w:fill="FFFFFF" w:themeFill="background1"/>
           </w:tcPr>
@@ -2297,16 +2458,23 @@
             <w:pPr>
               <w:pStyle w:val="Sinespaciado"/>
               <w:rPr>
+                <w:rFonts w:eastAsiaTheme="minorHAnsi" w:cstheme="minorHAnsi"/>
+                <w:lang w:eastAsia="en-US"/>
+              </w:rPr>
+            </w:pPr>
+            <w:r>
+              <w:rPr>
                 <w:rFonts w:ascii="Berlin Sans FB Demi" w:eastAsiaTheme="minorHAnsi" w:hAnsi="Berlin Sans FB Demi"/>
                 <w:lang w:eastAsia="en-US"/>
               </w:rPr>
-            </w:pPr>
-            <w:r>
-              <w:rPr>
-                <w:rFonts w:ascii="Berlin Sans FB Demi" w:eastAsiaTheme="minorHAnsi" w:hAnsi="Berlin Sans FB Demi"/>
-                <w:lang w:eastAsia="en-US"/>
-              </w:rPr>
               <w:t>SABER:</w:t>
+            </w:r>
+            <w:r>
+              <w:rPr>
+                <w:rFonts w:eastAsiaTheme="minorHAnsi" w:cstheme="minorHAnsi"/>
+                <w:lang w:eastAsia="en-US"/>
+              </w:rPr>
+              <w:t xml:space="preserve"> Analiza las normas de seguridad que promueve la ISO 45001.</w:t>
             </w:r>
           </w:p>
         </w:tc>
@@ -2314,7 +2482,7 @@
       <w:tr>
         <w:tc>
           <w:tcPr>
-            <w:tcW w:w="8863" w:type="dxa"/>
+            <w:tcW w:w="8624" w:type="dxa"/>
             <w:gridSpan w:val="3"/>
             <w:shd w:val="clear" w:color="auto" w:fill="FFFFFF" w:themeFill="background1"/>
           </w:tcPr>
@@ -2322,22 +2490,43 @@
             <w:pPr>
               <w:pStyle w:val="Sinespaciado"/>
               <w:rPr>
+                <w:rFonts w:eastAsiaTheme="minorHAnsi" w:cstheme="minorHAnsi"/>
+                <w:lang w:eastAsia="en-US"/>
+              </w:rPr>
+            </w:pPr>
+            <w:r>
+              <w:rPr>
                 <w:rFonts w:ascii="Berlin Sans FB Demi" w:eastAsiaTheme="minorHAnsi" w:hAnsi="Berlin Sans FB Demi"/>
                 <w:lang w:eastAsia="en-US"/>
               </w:rPr>
-            </w:pPr>
+              <w:t>VALORACIÓN:</w:t>
+            </w:r>
             <w:r>
               <w:rPr>
                 <w:rFonts w:ascii="Berlin Sans FB Demi" w:eastAsiaTheme="minorHAnsi" w:hAnsi="Berlin Sans FB Demi"/>
                 <w:lang w:eastAsia="en-US"/>
               </w:rPr>
-              <w:t>VALORACIÓN:</w:t>
-            </w:r>
-          </w:p>
-        </w:tc>
-        <w:tc>
-          <w:tcPr>
-            <w:tcW w:w="4700" w:type="dxa"/>
+              <w:t xml:space="preserve"> </w:t>
+            </w:r>
+            <w:r>
+              <w:rPr>
+                <w:rFonts w:eastAsiaTheme="minorHAnsi" w:cstheme="minorHAnsi"/>
+                <w:lang w:eastAsia="en-US"/>
+              </w:rPr>
+              <w:t xml:space="preserve">Valoramos la </w:t>
+            </w:r>
+            <w:r>
+              <w:rPr>
+                <w:rFonts w:eastAsiaTheme="minorHAnsi" w:cstheme="minorHAnsi"/>
+                <w:lang w:eastAsia="en-US"/>
+              </w:rPr>
+              <w:t>seguridad que ofrecen cumplir las normas de seguridad en ELT.</w:t>
+            </w:r>
+          </w:p>
+        </w:tc>
+        <w:tc>
+          <w:tcPr>
+            <w:tcW w:w="4939" w:type="dxa"/>
             <w:gridSpan w:val="2"/>
             <w:shd w:val="clear" w:color="auto" w:fill="FFFFFF" w:themeFill="background1"/>
           </w:tcPr>
@@ -2345,16 +2534,30 @@
             <w:pPr>
               <w:pStyle w:val="Sinespaciado"/>
               <w:rPr>
+                <w:rFonts w:eastAsiaTheme="minorHAnsi" w:cstheme="minorHAnsi"/>
+                <w:lang w:eastAsia="en-US"/>
+              </w:rPr>
+            </w:pPr>
+            <w:r>
+              <w:rPr>
                 <w:rFonts w:ascii="Berlin Sans FB Demi" w:eastAsiaTheme="minorHAnsi" w:hAnsi="Berlin Sans FB Demi"/>
                 <w:lang w:eastAsia="en-US"/>
               </w:rPr>
-            </w:pPr>
+              <w:t>HACER:</w:t>
+            </w:r>
             <w:r>
               <w:rPr>
                 <w:rFonts w:ascii="Berlin Sans FB Demi" w:eastAsiaTheme="minorHAnsi" w:hAnsi="Berlin Sans FB Demi"/>
                 <w:lang w:eastAsia="en-US"/>
               </w:rPr>
-              <w:t>HACER:</w:t>
+              <w:t xml:space="preserve"> </w:t>
+            </w:r>
+            <w:r>
+              <w:rPr>
+                <w:rFonts w:eastAsiaTheme="minorHAnsi" w:cstheme="minorHAnsi"/>
+                <w:lang w:eastAsia="en-US"/>
+              </w:rPr>
+              <w:t>Realiza el cuestionario de normas de seguridad en ELT.</w:t>
             </w:r>
           </w:p>
         </w:tc>
@@ -2362,7 +2565,7 @@
       <w:tr>
         <w:tc>
           <w:tcPr>
-            <w:tcW w:w="8863" w:type="dxa"/>
+            <w:tcW w:w="8624" w:type="dxa"/>
             <w:gridSpan w:val="3"/>
             <w:shd w:val="clear" w:color="auto" w:fill="FFFFFF" w:themeFill="background1"/>
           </w:tcPr>
@@ -2370,22 +2573,29 @@
             <w:pPr>
               <w:pStyle w:val="Sinespaciado"/>
               <w:rPr>
+                <w:rFonts w:eastAsiaTheme="minorHAnsi" w:cstheme="minorHAnsi"/>
+                <w:lang w:eastAsia="en-US"/>
+              </w:rPr>
+            </w:pPr>
+            <w:r>
+              <w:rPr>
                 <w:rFonts w:ascii="Berlin Sans FB Demi" w:eastAsiaTheme="minorHAnsi" w:hAnsi="Berlin Sans FB Demi"/>
                 <w:lang w:eastAsia="en-US"/>
               </w:rPr>
-            </w:pPr>
-            <w:r>
-              <w:rPr>
-                <w:rFonts w:ascii="Berlin Sans FB Demi" w:eastAsiaTheme="minorHAnsi" w:hAnsi="Berlin Sans FB Demi"/>
-                <w:lang w:eastAsia="en-US"/>
-              </w:rPr>
               <w:t>PRODUCCIÓN:</w:t>
             </w:r>
-          </w:p>
-        </w:tc>
-        <w:tc>
-          <w:tcPr>
-            <w:tcW w:w="4700" w:type="dxa"/>
+            <w:r>
+              <w:rPr>
+                <w:rFonts w:eastAsiaTheme="minorHAnsi" w:cstheme="minorHAnsi"/>
+                <w:lang w:eastAsia="en-US"/>
+              </w:rPr>
+              <w:t xml:space="preserve"> Realización de un cuestionario de normas de seguridad en ELT.</w:t>
+            </w:r>
+          </w:p>
+        </w:tc>
+        <w:tc>
+          <w:tcPr>
+            <w:tcW w:w="4939" w:type="dxa"/>
             <w:gridSpan w:val="2"/>
             <w:shd w:val="clear" w:color="auto" w:fill="FFFFFF" w:themeFill="background1"/>
           </w:tcPr>
@@ -2393,16 +2603,23 @@
             <w:pPr>
               <w:pStyle w:val="Sinespaciado"/>
               <w:rPr>
+                <w:rFonts w:eastAsiaTheme="minorHAnsi" w:cstheme="minorHAnsi"/>
+                <w:lang w:eastAsia="en-US"/>
+              </w:rPr>
+            </w:pPr>
+            <w:r>
+              <w:rPr>
                 <w:rFonts w:ascii="Berlin Sans FB Demi" w:eastAsiaTheme="minorHAnsi" w:hAnsi="Berlin Sans FB Demi"/>
                 <w:lang w:eastAsia="en-US"/>
               </w:rPr>
-            </w:pPr>
-            <w:r>
-              <w:rPr>
-                <w:rFonts w:ascii="Berlin Sans FB Demi" w:eastAsiaTheme="minorHAnsi" w:hAnsi="Berlin Sans FB Demi"/>
-                <w:lang w:eastAsia="en-US"/>
-              </w:rPr>
               <w:t xml:space="preserve">DECIDIR: </w:t>
+            </w:r>
+            <w:r>
+              <w:rPr>
+                <w:rFonts w:eastAsiaTheme="minorHAnsi" w:cstheme="minorHAnsi"/>
+                <w:lang w:eastAsia="en-US"/>
+              </w:rPr>
+              <w:t>Valora la salud personal en el taller de ELT.</w:t>
             </w:r>
           </w:p>
         </w:tc>
@@ -2695,11 +2912,47 @@
           </w:tcPr>
           <w:p>
             <w:pPr>
-              <w:pStyle w:val="Sinespaciado"/>
-            </w:pPr>
-            <w:r>
-              <w:t>Materiales físicos libros, revistas pedagógicas, etc. que se utilizan en el desarrollo curricular</w:t>
-            </w:r>
+              <w:spacing w:after="0" w:line="240" w:lineRule="auto"/>
+              <w:rPr>
+                <w:rFonts w:eastAsia="Times New Roman"/>
+                <w:lang w:eastAsia="es-419"/>
+              </w:rPr>
+            </w:pPr>
+            <w:r>
+              <w:rPr>
+                <w:rStyle w:val="fontstyle01"/>
+              </w:rPr>
+              <w:t xml:space="preserve">Marcadores, </w:t>
+            </w:r>
+            <w:r>
+              <w:rPr>
+                <w:rStyle w:val="fontstyle01"/>
+              </w:rPr>
+              <w:t xml:space="preserve">material oficina, </w:t>
+            </w:r>
+            <w:r>
+              <w:rPr>
+                <w:rStyle w:val="fontstyle01"/>
+              </w:rPr>
+              <w:t xml:space="preserve">texto </w:t>
+            </w:r>
+            <w:r>
+              <w:rPr>
+                <w:rStyle w:val="fontstyle01"/>
+              </w:rPr>
+              <w:t>ISO 45001</w:t>
+            </w:r>
+            <w:r>
+              <w:rPr>
+                <w:rStyle w:val="fontstyle01"/>
+              </w:rPr>
+              <w:t>.</w:t>
+            </w:r>
+          </w:p>
+          <w:p>
+            <w:pPr>
+              <w:pStyle w:val="Sinespaciado"/>
+            </w:pPr>
           </w:p>
           <w:p>
             <w:pPr>
@@ -2713,52 +2966,6 @@
             <w:gridSpan w:val="3"/>
             <w:shd w:val="clear" w:color="auto" w:fill="FFFFFF" w:themeFill="background1"/>
           </w:tcPr>
-          <w:p>
-            <w:pPr>
-              <w:pStyle w:val="Sinespaciado"/>
-            </w:pPr>
-            <w:r>
-              <w:t xml:space="preserve">Enlaces de videos, de herramientas virtuales como </w:t>
-            </w:r>
-            <w:proofErr w:type="spellStart"/>
-            <w:r>
-              <w:t>quizizz</w:t>
-            </w:r>
-            <w:proofErr w:type="spellEnd"/>
-            <w:r>
-              <w:t xml:space="preserve">, </w:t>
-            </w:r>
-            <w:proofErr w:type="spellStart"/>
-            <w:r>
-              <w:t>kahoot</w:t>
-            </w:r>
-            <w:proofErr w:type="spellEnd"/>
-            <w:r>
-              <w:t xml:space="preserve">, </w:t>
-            </w:r>
-            <w:proofErr w:type="spellStart"/>
-            <w:r>
-              <w:t>educaplay</w:t>
-            </w:r>
-            <w:proofErr w:type="spellEnd"/>
-            <w:r>
-              <w:t xml:space="preserve">, etc. – enlaces de páginas informativas </w:t>
-            </w:r>
-          </w:p>
-          <w:p>
-            <w:pPr>
-              <w:pStyle w:val="Sinespaciado"/>
-            </w:pPr>
-            <w:r>
-              <w:t xml:space="preserve">(los datos de internet – Google son muy generales y </w:t>
-            </w:r>
-            <w:r>
-              <w:t xml:space="preserve">son </w:t>
-            </w:r>
-            <w:r>
-              <w:t>buscadores)</w:t>
-            </w:r>
-          </w:p>
           <w:p>
             <w:pPr>
               <w:pStyle w:val="Sinespaciado"/>
@@ -2805,6 +3012,27 @@
                 <w:bCs/>
               </w:rPr>
             </w:pPr>
+            <w:r>
+              <w:rPr>
+                <w:rFonts w:eastAsiaTheme="minorHAnsi" w:cstheme="minorHAnsi"/>
+                <w:lang w:eastAsia="en-US"/>
+              </w:rPr>
+              <w:t>C</w:t>
+            </w:r>
+            <w:r>
+              <w:rPr>
+                <w:rFonts w:eastAsiaTheme="minorHAnsi" w:cstheme="minorHAnsi"/>
+                <w:lang w:eastAsia="en-US"/>
+              </w:rPr>
+              <w:t xml:space="preserve">uestionario de normas de seguridad en </w:t>
+            </w:r>
+            <w:r>
+              <w:rPr>
+                <w:rFonts w:eastAsiaTheme="minorHAnsi" w:cstheme="minorHAnsi"/>
+                <w:lang w:eastAsia="en-US"/>
+              </w:rPr>
+              <w:t>electricidad industrial.</w:t>
+            </w:r>
           </w:p>
         </w:tc>
       </w:tr>
@@ -2852,8 +3080,16 @@
               <w:pStyle w:val="Sinespaciado"/>
             </w:pPr>
             <w:r>
-              <w:t xml:space="preserve">Se cita al autor y titulo de libros textos, revistas pedagógicas y enlaces de material virtual que se utilizara en los temas avanzados en el desarrollo curricular.  </w:t>
-            </w:r>
+              <w:t xml:space="preserve">Fallece joven albañil de 27 años producto de una descarga eléctrica en Sucre, al parecer tocó cables de alta tensión - Agencia de Noticias Violeta </w:t>
+            </w:r>
+            <w:hyperlink r:id="rId8" w:history="1">
+              <w:r>
+                <w:rPr>
+                  <w:rStyle w:val="Hipervnculo"/>
+                </w:rPr>
+                <w:t>https://is.gd/5poOp0</w:t>
+              </w:r>
+            </w:hyperlink>
           </w:p>
         </w:tc>
       </w:tr>
@@ -3051,8 +3287,8 @@
       </w:r>
     </w:p>
     <w:sectPr>
-      <w:headerReference w:type="default" r:id="rId8"/>
-      <w:footerReference w:type="default" r:id="rId9"/>
+      <w:headerReference w:type="default" r:id="rId9"/>
+      <w:footerReference w:type="default" r:id="rId10"/>
       <w:pgSz w:w="15842" w:h="12242" w:orient="landscape" w:code="1"/>
       <w:pgMar w:top="1134" w:right="1134" w:bottom="1134" w:left="1134" w:header="709" w:footer="709" w:gutter="0"/>
       <w:cols w:space="708"/>
@@ -3737,11 +3973,127 @@
       </w:rPr>
     </w:lvl>
   </w:abstractNum>
+  <w:abstractNum w:abstractNumId="2" w15:restartNumberingAfterBreak="0">
+    <w:nsid w:val="53E06CE7"/>
+    <w:multiLevelType w:val="multilevel"/>
+    <w:tmpl w:val="53A42D8E"/>
+    <w:lvl w:ilvl="0">
+      <w:start w:val="1"/>
+      <w:numFmt w:val="bullet"/>
+      <w:lvlText w:val="●"/>
+      <w:lvlJc w:val="left"/>
+      <w:pPr>
+        <w:ind w:left="720" w:hanging="360"/>
+      </w:pPr>
+      <w:rPr>
+        <w:u w:val="none"/>
+      </w:rPr>
+    </w:lvl>
+    <w:lvl w:ilvl="1">
+      <w:start w:val="1"/>
+      <w:numFmt w:val="lowerLetter"/>
+      <w:lvlText w:val="%2."/>
+      <w:lvlJc w:val="left"/>
+      <w:pPr>
+        <w:ind w:left="1440" w:hanging="360"/>
+      </w:pPr>
+      <w:rPr>
+        <w:u w:val="none"/>
+      </w:rPr>
+    </w:lvl>
+    <w:lvl w:ilvl="2">
+      <w:start w:val="1"/>
+      <w:numFmt w:val="lowerRoman"/>
+      <w:lvlText w:val="%3."/>
+      <w:lvlJc w:val="right"/>
+      <w:pPr>
+        <w:ind w:left="2160" w:hanging="360"/>
+      </w:pPr>
+      <w:rPr>
+        <w:u w:val="none"/>
+      </w:rPr>
+    </w:lvl>
+    <w:lvl w:ilvl="3">
+      <w:start w:val="1"/>
+      <w:numFmt w:val="decimal"/>
+      <w:lvlText w:val="%4."/>
+      <w:lvlJc w:val="left"/>
+      <w:pPr>
+        <w:ind w:left="2880" w:hanging="360"/>
+      </w:pPr>
+      <w:rPr>
+        <w:u w:val="none"/>
+      </w:rPr>
+    </w:lvl>
+    <w:lvl w:ilvl="4">
+      <w:start w:val="1"/>
+      <w:numFmt w:val="lowerLetter"/>
+      <w:lvlText w:val="%5."/>
+      <w:lvlJc w:val="left"/>
+      <w:pPr>
+        <w:ind w:left="3600" w:hanging="360"/>
+      </w:pPr>
+      <w:rPr>
+        <w:u w:val="none"/>
+      </w:rPr>
+    </w:lvl>
+    <w:lvl w:ilvl="5">
+      <w:start w:val="1"/>
+      <w:numFmt w:val="lowerRoman"/>
+      <w:lvlText w:val="%6."/>
+      <w:lvlJc w:val="right"/>
+      <w:pPr>
+        <w:ind w:left="4320" w:hanging="360"/>
+      </w:pPr>
+      <w:rPr>
+        <w:u w:val="none"/>
+      </w:rPr>
+    </w:lvl>
+    <w:lvl w:ilvl="6">
+      <w:start w:val="1"/>
+      <w:numFmt w:val="decimal"/>
+      <w:lvlText w:val="%7."/>
+      <w:lvlJc w:val="left"/>
+      <w:pPr>
+        <w:ind w:left="5040" w:hanging="360"/>
+      </w:pPr>
+      <w:rPr>
+        <w:u w:val="none"/>
+      </w:rPr>
+    </w:lvl>
+    <w:lvl w:ilvl="7">
+      <w:start w:val="1"/>
+      <w:numFmt w:val="lowerLetter"/>
+      <w:lvlText w:val="%8."/>
+      <w:lvlJc w:val="left"/>
+      <w:pPr>
+        <w:ind w:left="5760" w:hanging="360"/>
+      </w:pPr>
+      <w:rPr>
+        <w:u w:val="none"/>
+      </w:rPr>
+    </w:lvl>
+    <w:lvl w:ilvl="8">
+      <w:start w:val="1"/>
+      <w:numFmt w:val="lowerRoman"/>
+      <w:lvlText w:val="%9."/>
+      <w:lvlJc w:val="right"/>
+      <w:pPr>
+        <w:ind w:left="6480" w:hanging="360"/>
+      </w:pPr>
+      <w:rPr>
+        <w:u w:val="none"/>
+      </w:rPr>
+    </w:lvl>
+  </w:abstractNum>
   <w:num w:numId="1" w16cid:durableId="1164781861">
     <w:abstractNumId w:val="0"/>
   </w:num>
   <w:num w:numId="2" w16cid:durableId="1520974456">
     <w:abstractNumId w:val="1"/>
+  </w:num>
+  <w:num w:numId="3" w16cid:durableId="1860313281">
+    <w:abstractNumId w:val="2"/>
   </w:num>
 </w:numbering>
 </file>
@@ -4156,7 +4508,6 @@
   <w:style w:type="character" w:default="1" w:styleId="Fuentedeprrafopredeter">
     <w:name w:val="Default Paragraph Font"/>
     <w:uiPriority w:val="1"/>
-    <w:semiHidden/>
     <w:unhideWhenUsed/>
   </w:style>
   <w:style w:type="table" w:default="1" w:styleId="Tablanormal">
@@ -4316,6 +4667,44 @@
     <w:uiPriority w:val="34"/>
     <w:locked/>
     <w:rsid w:val="00046389"/>
+  </w:style>
+  <w:style w:type="character" w:customStyle="1" w:styleId="fontstyle01">
+    <w:name w:val="fontstyle01"/>
+    <w:basedOn w:val="Fuentedeprrafopredeter"/>
+    <w:rsid w:val="008C7260"/>
+    <w:rPr>
+      <w:rFonts w:ascii="Calibri" w:hAnsi="Calibri" w:cs="Calibri" w:hint="default"/>
+      <w:b w:val="0"/>
+      <w:bCs w:val="0"/>
+      <w:i w:val="0"/>
+      <w:iCs w:val="0"/>
+      <w:color w:val="000000"/>
+      <w:sz w:val="22"/>
+      <w:szCs w:val="22"/>
+    </w:rPr>
+  </w:style>
+  <w:style w:type="character" w:styleId="Hipervnculo">
+    <w:name w:val="Hyperlink"/>
+    <w:basedOn w:val="Fuentedeprrafopredeter"/>
+    <w:uiPriority w:val="99"/>
+    <w:unhideWhenUsed/>
+    <w:rsid w:val="00C94978"/>
+    <w:rPr>
+      <w:color w:val="0563C1" w:themeColor="hyperlink"/>
+      <w:u w:val="single"/>
+    </w:rPr>
+  </w:style>
+  <w:style w:type="character" w:styleId="Mencinsinresolver">
+    <w:name w:val="Unresolved Mention"/>
+    <w:basedOn w:val="Fuentedeprrafopredeter"/>
+    <w:uiPriority w:val="99"/>
+    <w:semiHidden/>
+    <w:unhideWhenUsed/>
+    <w:rsid w:val="00C94978"/>
+    <w:rPr>
+      <w:color w:val="605E5C"/>
+      <w:shd w:val="clear" w:color="auto" w:fill="E1DFDD"/>
+    </w:rPr>
   </w:style>
 </w:styles>
 </file>

</xml_diff>

<commit_message>
Tte sis inf mar imprimir
</commit_message>
<xml_diff>
--- a/PDC_2025_3ro_TTG.docx
+++ b/PDC_2025_3ro_TTG.docx
@@ -501,35 +501,7 @@
               <w:rPr>
                 <w:rFonts w:cstheme="minorHAnsi"/>
               </w:rPr>
-              <w:t xml:space="preserve">Fray Paulo </w:t>
-            </w:r>
-            <w:proofErr w:type="spellStart"/>
-            <w:r>
-              <w:rPr>
-                <w:rFonts w:cstheme="minorHAnsi"/>
-              </w:rPr>
-              <w:t>Charupa</w:t>
-            </w:r>
-            <w:proofErr w:type="spellEnd"/>
-            <w:r>
-              <w:rPr>
-                <w:rFonts w:cstheme="minorHAnsi"/>
-              </w:rPr>
-              <w:t xml:space="preserve"> </w:t>
-            </w:r>
-            <w:proofErr w:type="spellStart"/>
-            <w:r>
-              <w:rPr>
-                <w:rFonts w:cstheme="minorHAnsi"/>
-              </w:rPr>
-              <w:t>Masabi</w:t>
-            </w:r>
-            <w:proofErr w:type="spellEnd"/>
-            <w:r>
-              <w:rPr>
-                <w:rFonts w:cstheme="minorHAnsi"/>
-              </w:rPr>
-              <w:t xml:space="preserve"> O.F.M. </w:t>
+              <w:t xml:space="preserve">Fray Paulo Charupa Masabi O.F.M. </w:t>
             </w:r>
           </w:p>
         </w:tc>
@@ -705,6 +677,12 @@
                 <w:rFonts w:cstheme="minorHAnsi"/>
               </w:rPr>
             </w:pPr>
+            <w:r>
+              <w:rPr>
+                <w:rFonts w:cstheme="minorHAnsi"/>
+              </w:rPr>
+              <w:t>TTE Sistemas Informáticos</w:t>
+            </w:r>
           </w:p>
         </w:tc>
       </w:tr>
@@ -811,6 +789,12 @@
                 <w:rFonts w:cstheme="minorHAnsi"/>
               </w:rPr>
             </w:pPr>
+            <w:r>
+              <w:rPr>
+                <w:rFonts w:cstheme="minorHAnsi"/>
+              </w:rPr>
+              <w:t>Marzo</w:t>
+            </w:r>
           </w:p>
         </w:tc>
       </w:tr>
@@ -1433,25 +1417,7 @@
               <w:rPr>
                 <w:rFonts w:cstheme="minorHAnsi"/>
               </w:rPr>
-              <w:t>Planificar desde su área actividad</w:t>
-            </w:r>
-            <w:r>
-              <w:rPr>
-                <w:rFonts w:cstheme="minorHAnsi"/>
-              </w:rPr>
-              <w:t>es</w:t>
-            </w:r>
-            <w:r>
-              <w:rPr>
-                <w:rFonts w:cstheme="minorHAnsi"/>
-              </w:rPr>
-              <w:t xml:space="preserve"> que ayude a consolidar el proyecto socio comunitario productivo en </w:t>
-            </w:r>
-            <w:r>
-              <w:rPr>
-                <w:rFonts w:cstheme="minorHAnsi"/>
-              </w:rPr>
-              <w:t>el desarrollo de sus clases</w:t>
+              <w:t>Taller de reflexión a los padres de familia sobre el mal uso de las redes sociales y el consumo del alcohol “fortaleciendo las relaciones en la familia”.</w:t>
             </w:r>
           </w:p>
           <w:p>
@@ -1475,41 +1441,30 @@
           </w:tcPr>
           <w:p>
             <w:pPr>
-              <w:pStyle w:val="Sinespaciado"/>
-              <w:spacing w:line="276" w:lineRule="auto"/>
-              <w:rPr>
-                <w:rFonts w:cstheme="minorHAnsi"/>
-              </w:rPr>
-            </w:pPr>
-            <w:r>
-              <w:rPr>
-                <w:rFonts w:cstheme="minorHAnsi"/>
-              </w:rPr>
-              <w:t xml:space="preserve">Incluir en su </w:t>
-            </w:r>
-            <w:r>
-              <w:rPr>
-                <w:rFonts w:cstheme="minorHAnsi"/>
-              </w:rPr>
-              <w:t>área actividad</w:t>
-            </w:r>
-            <w:r>
-              <w:rPr>
-                <w:rFonts w:cstheme="minorHAnsi"/>
-              </w:rPr>
-              <w:t>es</w:t>
-            </w:r>
-            <w:r>
-              <w:rPr>
-                <w:rFonts w:cstheme="minorHAnsi"/>
-              </w:rPr>
-              <w:t xml:space="preserve"> que </w:t>
-            </w:r>
-            <w:r>
-              <w:rPr>
-                <w:rFonts w:cstheme="minorHAnsi"/>
-              </w:rPr>
-              <w:t xml:space="preserve">promuevan la convivencia pacífica y armónica en el desarrollo de sus clases </w:t>
+              <w:spacing w:after="0" w:line="240" w:lineRule="auto"/>
+              <w:jc w:val="both"/>
+              <w:rPr>
+                <w:rFonts w:eastAsia="Times New Roman"/>
+                <w:lang w:eastAsia="es-419"/>
+              </w:rPr>
+            </w:pPr>
+            <w:r>
+              <w:rPr>
+                <w:rStyle w:val="fontstyle01"/>
+              </w:rPr>
+              <w:t>Realización de cuestionario sobre el tema</w:t>
+            </w:r>
+            <w:r>
+              <w:rPr>
+                <w:rStyle w:val="fontstyle01"/>
+              </w:rPr>
+              <w:t xml:space="preserve"> en grupos</w:t>
+            </w:r>
+            <w:r>
+              <w:rPr>
+                <w:rStyle w:val="fontstyle01"/>
+              </w:rPr>
+              <w:t>.</w:t>
             </w:r>
           </w:p>
           <w:p>
@@ -1532,17 +1487,49 @@
           </w:tcPr>
           <w:p>
             <w:pPr>
-              <w:pStyle w:val="Sinespaciado"/>
-              <w:spacing w:line="276" w:lineRule="auto"/>
-              <w:rPr>
-                <w:rFonts w:cstheme="minorHAnsi"/>
-              </w:rPr>
-            </w:pPr>
-            <w:r>
-              <w:rPr>
-                <w:rFonts w:cstheme="minorHAnsi"/>
-              </w:rPr>
-              <w:t>Explicar con que actividades promovemos la lectura comprensiva en las y los estudiantes desde el trabajo de mi área</w:t>
+              <w:spacing w:after="0" w:line="240" w:lineRule="auto"/>
+              <w:jc w:val="both"/>
+              <w:rPr>
+                <w:rFonts w:eastAsia="Times New Roman"/>
+                <w:lang w:eastAsia="es-419"/>
+              </w:rPr>
+            </w:pPr>
+            <w:r>
+              <w:rPr>
+                <w:rStyle w:val="fontstyle01"/>
+              </w:rPr>
+              <w:t>Lectura del libro “El sueño de la inteligencia</w:t>
+            </w:r>
+            <w:r>
+              <w:rPr>
+                <w:rFonts w:ascii="Calibri" w:hAnsi="Calibri" w:cs="Calibri"/>
+                <w:color w:val="000000"/>
+              </w:rPr>
+              <w:br/>
+            </w:r>
+            <w:r>
+              <w:rPr>
+                <w:rStyle w:val="fontstyle01"/>
+              </w:rPr>
+              <w:t>artificial”</w:t>
+            </w:r>
+            <w:r>
+              <w:rPr>
+                <w:rStyle w:val="fontstyle01"/>
+              </w:rPr>
+              <w:t xml:space="preserve"> y realización de un resumen de cada </w:t>
+            </w:r>
+            <w:r>
+              <w:rPr>
+                <w:rStyle w:val="fontstyle01"/>
+              </w:rPr>
+              <w:t>capítulo</w:t>
+            </w:r>
+            <w:r>
+              <w:rPr>
+                <w:rStyle w:val="fontstyle01"/>
+              </w:rPr>
+              <w:t>.</w:t>
             </w:r>
           </w:p>
           <w:p>
@@ -1707,6 +1694,12 @@
                 <w:rFonts w:cstheme="minorHAnsi"/>
               </w:rPr>
             </w:pPr>
+            <w:r>
+              <w:rPr>
+                <w:rFonts w:cstheme="minorHAnsi"/>
+              </w:rPr>
+              <w:t>4º</w:t>
+            </w:r>
           </w:p>
         </w:tc>
         <w:tc>
@@ -1751,6 +1744,12 @@
                 <w:rFonts w:cstheme="minorHAnsi"/>
               </w:rPr>
             </w:pPr>
+            <w:r>
+              <w:rPr>
+                <w:rFonts w:cstheme="minorHAnsi"/>
+              </w:rPr>
+              <w:t>A, B, C y D</w:t>
+            </w:r>
           </w:p>
         </w:tc>
       </w:tr>
@@ -1818,7 +1817,49 @@
                 <w:rFonts w:cstheme="minorHAnsi"/>
                 <w:bCs/>
               </w:rPr>
-              <w:t xml:space="preserve">(Elaborar el objetivo holístico del mes en relación al Objetivo Holístico de Secundaria – de trimestre y al Proyecto Sociocomunitario Productivo) </w:t>
+              <w:t xml:space="preserve">Fortalecemos la responsabilidad, solidaridad y complementariedad, a través del estudio de las normas de </w:t>
+            </w:r>
+            <w:r>
+              <w:rPr>
+                <w:rFonts w:cstheme="minorHAnsi"/>
+                <w:bCs/>
+              </w:rPr>
+              <w:t>actuación en primeros auxilios</w:t>
+            </w:r>
+            <w:r>
+              <w:rPr>
+                <w:rFonts w:cstheme="minorHAnsi"/>
+                <w:bCs/>
+              </w:rPr>
+              <w:t>, elaborando</w:t>
+            </w:r>
+            <w:r>
+              <w:rPr>
+                <w:rFonts w:cstheme="minorHAnsi"/>
+                <w:bCs/>
+              </w:rPr>
+              <w:t xml:space="preserve"> </w:t>
+            </w:r>
+            <w:r>
+              <w:rPr>
+                <w:rFonts w:cstheme="minorHAnsi"/>
+                <w:bCs/>
+              </w:rPr>
+              <w:t xml:space="preserve">un cuestionario de </w:t>
+            </w:r>
+            <w:r>
+              <w:rPr>
+                <w:rFonts w:cstheme="minorHAnsi"/>
+                <w:bCs/>
+              </w:rPr>
+              <w:t>y dramatización de alguna maniobra de primeros auxilios</w:t>
+            </w:r>
+            <w:r>
+              <w:rPr>
+                <w:rFonts w:cstheme="minorHAnsi"/>
+                <w:bCs/>
+              </w:rPr>
+              <w:t>, para preservar la vida del ser humano y madre tierra.</w:t>
             </w:r>
           </w:p>
         </w:tc>
@@ -1867,34 +1908,41 @@
           </w:tcPr>
           <w:p>
             <w:pPr>
-              <w:tabs>
-                <w:tab w:val="left" w:pos="210"/>
-              </w:tabs>
-              <w:rPr>
-                <w:rFonts w:cstheme="minorHAnsi"/>
-                <w:bCs/>
-              </w:rPr>
-            </w:pPr>
-            <w:r>
-              <w:rPr>
-                <w:rFonts w:cstheme="minorHAnsi"/>
-                <w:bCs/>
-              </w:rPr>
-              <w:t xml:space="preserve">(Los perfiles de salida están establecidos en los planes y programas; de ahí elija uno o </w:t>
-            </w:r>
-            <w:r>
-              <w:rPr>
-                <w:rFonts w:cstheme="minorHAnsi"/>
-                <w:bCs/>
-              </w:rPr>
-              <w:t xml:space="preserve">dos </w:t>
-            </w:r>
-            <w:r>
-              <w:rPr>
-                <w:rFonts w:cstheme="minorHAnsi"/>
-                <w:bCs/>
-              </w:rPr>
-              <w:t xml:space="preserve">que tengan relación con los temas planteados en los contenidos y que correspondan al primer trimestre de su área de saberes y conocimientos) </w:t>
+              <w:spacing w:after="0" w:line="240" w:lineRule="auto"/>
+              <w:rPr>
+                <w:rFonts w:eastAsia="Times New Roman"/>
+                <w:lang w:eastAsia="es-419"/>
+              </w:rPr>
+            </w:pPr>
+            <w:r>
+              <w:rPr>
+                <w:rStyle w:val="fontstyle01"/>
+              </w:rPr>
+              <w:t xml:space="preserve">Reconoce las normas de </w:t>
+            </w:r>
+            <w:r>
+              <w:rPr>
+                <w:rStyle w:val="fontstyle01"/>
+              </w:rPr>
+              <w:t>actuación de primeros auxilios</w:t>
+            </w:r>
+            <w:r>
+              <w:rPr>
+                <w:rStyle w:val="fontstyle01"/>
+              </w:rPr>
+              <w:t>,</w:t>
+            </w:r>
+            <w:r>
+              <w:rPr>
+                <w:rStyle w:val="fontstyle01"/>
+              </w:rPr>
+              <w:t xml:space="preserve"> respetando las normas de actuación ante una emergencia de un paciente accidentado.</w:t>
+            </w:r>
+            <w:r>
+              <w:rPr>
+                <w:rStyle w:val="fontstyle01"/>
+              </w:rPr>
+              <w:t xml:space="preserve"> </w:t>
             </w:r>
           </w:p>
         </w:tc>
@@ -1967,6 +2015,228 @@
           </w:tcPr>
           <w:p>
             <w:pPr>
+              <w:ind w:left="-9"/>
+              <w:jc w:val="both"/>
+              <w:rPr>
+                <w:rFonts w:ascii="Arial" w:eastAsia="Arial" w:hAnsi="Arial" w:cs="Arial"/>
+                <w:b/>
+                <w:bCs/>
+                <w:sz w:val="20"/>
+                <w:szCs w:val="20"/>
+              </w:rPr>
+            </w:pPr>
+            <w:r>
+              <w:rPr>
+                <w:rFonts w:ascii="Arial" w:eastAsia="Arial" w:hAnsi="Arial" w:cs="Arial"/>
+                <w:b/>
+                <w:bCs/>
+                <w:sz w:val="20"/>
+                <w:szCs w:val="20"/>
+              </w:rPr>
+              <w:t>PRIMEROS AUXILIOS</w:t>
+            </w:r>
+          </w:p>
+          <w:p>
+            <w:pPr>
+              <w:numPr>
+                <w:ilvl w:val="0"/>
+                <w:numId w:val="3"/>
+              </w:numPr>
+              <w:spacing w:after="0" w:line="240" w:lineRule="auto"/>
+              <w:ind w:left="141" w:hanging="150"/>
+              <w:jc w:val="both"/>
+              <w:rPr>
+                <w:rFonts w:ascii="Arial" w:eastAsia="Arial" w:hAnsi="Arial" w:cs="Arial"/>
+                <w:sz w:val="20"/>
+                <w:szCs w:val="20"/>
+              </w:rPr>
+            </w:pPr>
+            <w:r>
+              <w:rPr>
+                <w:rFonts w:ascii="Arial" w:eastAsia="Arial" w:hAnsi="Arial" w:cs="Arial"/>
+                <w:sz w:val="20"/>
+                <w:szCs w:val="20"/>
+              </w:rPr>
+              <w:t>Principios básicos y normas de actuació</w:t>
+            </w:r>
+            <w:r>
+              <w:rPr>
+                <w:rFonts w:ascii="Arial" w:eastAsia="Arial" w:hAnsi="Arial" w:cs="Arial"/>
+                <w:sz w:val="20"/>
+                <w:szCs w:val="20"/>
+              </w:rPr>
+              <w:t>n.</w:t>
+            </w:r>
+          </w:p>
+          <w:p>
+            <w:pPr>
+              <w:numPr>
+                <w:ilvl w:val="0"/>
+                <w:numId w:val="3"/>
+              </w:numPr>
+              <w:spacing w:after="0" w:line="240" w:lineRule="auto"/>
+              <w:ind w:left="141" w:hanging="150"/>
+              <w:jc w:val="both"/>
+              <w:rPr>
+                <w:rFonts w:ascii="Arial" w:eastAsia="Arial" w:hAnsi="Arial" w:cs="Arial"/>
+                <w:sz w:val="20"/>
+                <w:szCs w:val="20"/>
+              </w:rPr>
+            </w:pPr>
+            <w:r>
+              <w:rPr>
+                <w:rFonts w:ascii="Arial" w:eastAsia="Arial" w:hAnsi="Arial" w:cs="Arial"/>
+                <w:sz w:val="20"/>
+                <w:szCs w:val="20"/>
+              </w:rPr>
+              <w:t>Reconocimiento de signos vitales y reanimación</w:t>
+            </w:r>
+          </w:p>
+          <w:p>
+            <w:pPr>
+              <w:numPr>
+                <w:ilvl w:val="0"/>
+                <w:numId w:val="3"/>
+              </w:numPr>
+              <w:spacing w:after="0" w:line="240" w:lineRule="auto"/>
+              <w:ind w:left="141" w:hanging="150"/>
+              <w:jc w:val="both"/>
+              <w:rPr>
+                <w:rFonts w:ascii="Arial" w:eastAsia="Arial" w:hAnsi="Arial" w:cs="Arial"/>
+                <w:sz w:val="20"/>
+                <w:szCs w:val="20"/>
+              </w:rPr>
+            </w:pPr>
+            <w:r>
+              <w:rPr>
+                <w:rFonts w:ascii="Arial" w:eastAsia="Arial" w:hAnsi="Arial" w:cs="Arial"/>
+                <w:sz w:val="20"/>
+                <w:szCs w:val="20"/>
+              </w:rPr>
+              <w:t>Material y locales de primeros auxilios</w:t>
+            </w:r>
+          </w:p>
+          <w:p>
+            <w:pPr>
+              <w:numPr>
+                <w:ilvl w:val="0"/>
+                <w:numId w:val="3"/>
+              </w:numPr>
+              <w:spacing w:after="0" w:line="240" w:lineRule="auto"/>
+              <w:ind w:left="141" w:hanging="150"/>
+              <w:jc w:val="both"/>
+              <w:rPr>
+                <w:rFonts w:ascii="Arial" w:eastAsia="Arial" w:hAnsi="Arial" w:cs="Arial"/>
+                <w:sz w:val="20"/>
+                <w:szCs w:val="20"/>
+              </w:rPr>
+            </w:pPr>
+            <w:r>
+              <w:rPr>
+                <w:rFonts w:ascii="Arial" w:eastAsia="Arial" w:hAnsi="Arial" w:cs="Arial"/>
+                <w:sz w:val="20"/>
+                <w:szCs w:val="20"/>
+              </w:rPr>
+              <w:t>Tipos de riesgos</w:t>
+            </w:r>
+          </w:p>
+          <w:p>
+            <w:pPr>
+              <w:spacing w:after="0" w:line="240" w:lineRule="auto"/>
+              <w:ind w:left="-9"/>
+              <w:jc w:val="both"/>
+              <w:rPr>
+                <w:rFonts w:ascii="Arial" w:eastAsia="Arial" w:hAnsi="Arial" w:cs="Arial"/>
+                <w:sz w:val="20"/>
+                <w:szCs w:val="20"/>
+              </w:rPr>
+            </w:pPr>
+          </w:p>
+          <w:p>
+            <w:pPr>
+              <w:ind w:left="-9"/>
+              <w:jc w:val="both"/>
+              <w:rPr>
+                <w:rFonts w:ascii="Arial" w:eastAsia="Arial" w:hAnsi="Arial" w:cs="Arial"/>
+                <w:sz w:val="20"/>
+                <w:szCs w:val="20"/>
+              </w:rPr>
+            </w:pPr>
+            <w:r>
+              <w:rPr>
+                <w:rFonts w:ascii="Arial" w:eastAsia="Arial" w:hAnsi="Arial" w:cs="Arial"/>
+                <w:sz w:val="20"/>
+                <w:szCs w:val="20"/>
+              </w:rPr>
+              <w:t>DERECHO LABORAL</w:t>
+            </w:r>
+          </w:p>
+          <w:p>
+            <w:pPr>
+              <w:numPr>
+                <w:ilvl w:val="0"/>
+                <w:numId w:val="3"/>
+              </w:numPr>
+              <w:spacing w:after="0" w:line="240" w:lineRule="auto"/>
+              <w:ind w:left="141" w:hanging="150"/>
+              <w:jc w:val="both"/>
+              <w:rPr>
+                <w:rFonts w:ascii="Arial" w:eastAsia="Arial" w:hAnsi="Arial" w:cs="Arial"/>
+                <w:sz w:val="20"/>
+                <w:szCs w:val="20"/>
+              </w:rPr>
+            </w:pPr>
+            <w:r>
+              <w:rPr>
+                <w:rFonts w:ascii="Arial" w:eastAsia="Arial" w:hAnsi="Arial" w:cs="Arial"/>
+                <w:sz w:val="20"/>
+                <w:szCs w:val="20"/>
+              </w:rPr>
+              <w:t>Ley General del Trabajo</w:t>
+            </w:r>
+            <w:r>
+              <w:rPr>
+                <w:rFonts w:ascii="Arial" w:eastAsia="Arial" w:hAnsi="Arial" w:cs="Arial"/>
+                <w:sz w:val="20"/>
+                <w:szCs w:val="20"/>
+              </w:rPr>
+              <w:t>.</w:t>
+            </w:r>
+          </w:p>
+          <w:p>
+            <w:pPr>
+              <w:numPr>
+                <w:ilvl w:val="0"/>
+                <w:numId w:val="3"/>
+              </w:numPr>
+              <w:spacing w:after="0" w:line="240" w:lineRule="auto"/>
+              <w:ind w:left="141" w:hanging="150"/>
+              <w:jc w:val="both"/>
+              <w:rPr>
+                <w:rFonts w:ascii="Arial" w:eastAsia="Arial" w:hAnsi="Arial" w:cs="Arial"/>
+                <w:sz w:val="20"/>
+                <w:szCs w:val="20"/>
+              </w:rPr>
+            </w:pPr>
+            <w:r>
+              <w:rPr>
+                <w:rFonts w:ascii="Arial" w:eastAsia="Arial" w:hAnsi="Arial" w:cs="Arial"/>
+                <w:sz w:val="20"/>
+                <w:szCs w:val="20"/>
+              </w:rPr>
+              <w:t>Derecho al trabajo y al empleo</w:t>
+            </w:r>
+            <w:r>
+              <w:rPr>
+                <w:rFonts w:ascii="Arial" w:eastAsia="Arial" w:hAnsi="Arial" w:cs="Arial"/>
+                <w:sz w:val="20"/>
+                <w:szCs w:val="20"/>
+              </w:rPr>
+              <w:t>.</w:t>
+            </w:r>
+          </w:p>
+          <w:p>
+            <w:pPr>
               <w:tabs>
                 <w:tab w:val="left" w:pos="210"/>
               </w:tabs>
@@ -1977,22 +2247,12 @@
             </w:pPr>
             <w:r>
               <w:rPr>
-                <w:rFonts w:cstheme="minorHAnsi"/>
-                <w:bCs/>
-              </w:rPr>
-              <w:t>Seleccione los contenidos que considere pertinente desarrollar en el tiempo establecido en la planificación</w:t>
-            </w:r>
-          </w:p>
-          <w:p>
-            <w:pPr>
-              <w:tabs>
-                <w:tab w:val="left" w:pos="210"/>
-              </w:tabs>
-              <w:rPr>
-                <w:rFonts w:cstheme="minorHAnsi"/>
-                <w:bCs/>
-              </w:rPr>
-            </w:pPr>
+                <w:rFonts w:ascii="Arial" w:eastAsia="Arial" w:hAnsi="Arial" w:cs="Arial"/>
+                <w:sz w:val="20"/>
+                <w:szCs w:val="20"/>
+              </w:rPr>
+              <w:t>Responsabilidades y derechos del trabajador y empleado</w:t>
+            </w:r>
           </w:p>
         </w:tc>
         <w:tc>
@@ -2017,16 +2277,12 @@
               <w:rPr>
                 <w:rFonts w:cstheme="minorHAnsi"/>
               </w:rPr>
-              <w:t xml:space="preserve">Educación Intracultural, intercultural y plurilingüe </w:t>
-            </w:r>
-          </w:p>
-          <w:p>
-            <w:pPr>
-              <w:pStyle w:val="Sinespaciado"/>
-              <w:numPr>
-                <w:ilvl w:val="0"/>
-                <w:numId w:val="2"/>
-              </w:numPr>
+              <w:t>Educación para la producción</w:t>
+            </w:r>
+          </w:p>
+          <w:p>
+            <w:pPr>
+              <w:pStyle w:val="Sinespaciado"/>
               <w:spacing w:line="276" w:lineRule="auto"/>
               <w:rPr>
                 <w:rFonts w:cstheme="minorHAnsi"/>
@@ -2036,60 +2292,7 @@
               <w:rPr>
                 <w:rFonts w:cstheme="minorHAnsi"/>
               </w:rPr>
-              <w:t>Educación en Valores Sociocomunitarios</w:t>
-            </w:r>
-          </w:p>
-          <w:p>
-            <w:pPr>
-              <w:pStyle w:val="Sinespaciado"/>
-              <w:numPr>
-                <w:ilvl w:val="0"/>
-                <w:numId w:val="2"/>
-              </w:numPr>
-              <w:spacing w:line="276" w:lineRule="auto"/>
-              <w:rPr>
-                <w:rFonts w:cstheme="minorHAnsi"/>
-              </w:rPr>
-            </w:pPr>
-            <w:r>
-              <w:rPr>
-                <w:rFonts w:cstheme="minorHAnsi"/>
-              </w:rPr>
-              <w:t>Educación en Convivencia con la Madre Tierra y Salud Comunitaria</w:t>
-            </w:r>
-          </w:p>
-          <w:p>
-            <w:pPr>
-              <w:pStyle w:val="Sinespaciado"/>
-              <w:numPr>
-                <w:ilvl w:val="0"/>
-                <w:numId w:val="2"/>
-              </w:numPr>
-              <w:spacing w:line="276" w:lineRule="auto"/>
-              <w:rPr>
-                <w:rFonts w:cstheme="minorHAnsi"/>
-              </w:rPr>
-            </w:pPr>
-            <w:r>
-              <w:rPr>
-                <w:rFonts w:cstheme="minorHAnsi"/>
-              </w:rPr>
-              <w:t>Educación para la producción</w:t>
-            </w:r>
-          </w:p>
-          <w:p>
-            <w:pPr>
-              <w:pStyle w:val="Sinespaciado"/>
-              <w:spacing w:line="276" w:lineRule="auto"/>
-              <w:rPr>
-                <w:rFonts w:cstheme="minorHAnsi"/>
-              </w:rPr>
-            </w:pPr>
-            <w:r>
-              <w:rPr>
-                <w:rFonts w:cstheme="minorHAnsi"/>
-              </w:rPr>
-              <w:t>(Explicar que eje articulador aplica en su plan)</w:t>
+              <w:t>Actuación ante una emergencia médica, de acuerdo a las normas de primeros auxilios.</w:t>
             </w:r>
           </w:p>
         </w:tc>
@@ -2112,19 +2315,9 @@
         </w:rPr>
         <w:tab/>
       </w:r>
-    </w:p>
-    <w:p>
-      <w:pPr>
-        <w:spacing w:after="160" w:line="259" w:lineRule="auto"/>
-      </w:pPr>
       <w:r>
         <w:br w:type="page"/>
       </w:r>
-    </w:p>
-    <w:p>
-      <w:pPr>
-        <w:pStyle w:val="Sinespaciado"/>
-      </w:pPr>
     </w:p>
     <w:tbl>
       <w:tblPr>
@@ -2169,6 +2362,7 @@
                 <w:rFonts w:ascii="Berlin Sans FB Demi" w:eastAsiaTheme="minorHAnsi" w:hAnsi="Berlin Sans FB Demi"/>
                 <w:lang w:eastAsia="en-US"/>
               </w:rPr>
+              <w:lastRenderedPageBreak/>
               <w:t>ORIENTACIONES METODOLÓGICAS</w:t>
             </w:r>
           </w:p>
@@ -2226,16 +2420,30 @@
             <w:pPr>
               <w:pStyle w:val="Sinespaciado"/>
               <w:rPr>
+                <w:rFonts w:eastAsiaTheme="minorHAnsi" w:cstheme="minorHAnsi"/>
+                <w:lang w:eastAsia="en-US"/>
+              </w:rPr>
+            </w:pPr>
+            <w:r>
+              <w:rPr>
                 <w:rFonts w:ascii="Berlin Sans FB Demi" w:eastAsiaTheme="minorHAnsi" w:hAnsi="Berlin Sans FB Demi"/>
                 <w:lang w:eastAsia="en-US"/>
               </w:rPr>
-            </w:pPr>
+              <w:t>PRACTICA:</w:t>
+            </w:r>
             <w:r>
               <w:rPr>
                 <w:rFonts w:ascii="Berlin Sans FB Demi" w:eastAsiaTheme="minorHAnsi" w:hAnsi="Berlin Sans FB Demi"/>
                 <w:lang w:eastAsia="en-US"/>
               </w:rPr>
-              <w:t>PRACTICA:</w:t>
+              <w:t xml:space="preserve"> </w:t>
+            </w:r>
+            <w:r>
+              <w:rPr>
+                <w:rFonts w:eastAsiaTheme="minorHAnsi" w:cstheme="minorHAnsi"/>
+                <w:lang w:eastAsia="en-US"/>
+              </w:rPr>
+              <w:t>Miramos el video sobre actuación en primeros auxilios.</w:t>
             </w:r>
           </w:p>
         </w:tc>
@@ -2249,16 +2457,23 @@
             <w:pPr>
               <w:pStyle w:val="Sinespaciado"/>
               <w:rPr>
+                <w:rFonts w:eastAsiaTheme="minorHAnsi" w:cstheme="minorHAnsi"/>
+                <w:lang w:eastAsia="en-US"/>
+              </w:rPr>
+            </w:pPr>
+            <w:r>
+              <w:rPr>
                 <w:rFonts w:ascii="Berlin Sans FB Demi" w:eastAsiaTheme="minorHAnsi" w:hAnsi="Berlin Sans FB Demi"/>
                 <w:lang w:eastAsia="en-US"/>
               </w:rPr>
-            </w:pPr>
-            <w:r>
-              <w:rPr>
-                <w:rFonts w:ascii="Berlin Sans FB Demi" w:eastAsiaTheme="minorHAnsi" w:hAnsi="Berlin Sans FB Demi"/>
-                <w:lang w:eastAsia="en-US"/>
-              </w:rPr>
               <w:t xml:space="preserve">SER: </w:t>
+            </w:r>
+            <w:r>
+              <w:rPr>
+                <w:rFonts w:eastAsiaTheme="minorHAnsi" w:cstheme="minorHAnsi"/>
+                <w:lang w:eastAsia="en-US"/>
+              </w:rPr>
+              <w:t>Respeto y participación en el aula.</w:t>
             </w:r>
           </w:p>
         </w:tc>
@@ -2274,16 +2489,30 @@
             <w:pPr>
               <w:pStyle w:val="Sinespaciado"/>
               <w:rPr>
+                <w:rFonts w:eastAsiaTheme="minorHAnsi" w:cstheme="minorHAnsi"/>
+                <w:lang w:eastAsia="en-US"/>
+              </w:rPr>
+            </w:pPr>
+            <w:r>
+              <w:rPr>
                 <w:rFonts w:ascii="Berlin Sans FB Demi" w:eastAsiaTheme="minorHAnsi" w:hAnsi="Berlin Sans FB Demi"/>
                 <w:lang w:eastAsia="en-US"/>
               </w:rPr>
-            </w:pPr>
+              <w:t>TEORÍA:</w:t>
+            </w:r>
             <w:r>
               <w:rPr>
                 <w:rFonts w:ascii="Berlin Sans FB Demi" w:eastAsiaTheme="minorHAnsi" w:hAnsi="Berlin Sans FB Demi"/>
                 <w:lang w:eastAsia="en-US"/>
               </w:rPr>
-              <w:t>TEORÍA:</w:t>
+              <w:t xml:space="preserve"> </w:t>
+            </w:r>
+            <w:r>
+              <w:rPr>
+                <w:rFonts w:eastAsiaTheme="minorHAnsi" w:cstheme="minorHAnsi"/>
+                <w:lang w:eastAsia="en-US"/>
+              </w:rPr>
+              <w:t>Analizamos las normas de actuación ante emergencia médica.</w:t>
             </w:r>
           </w:p>
         </w:tc>
@@ -2297,16 +2526,30 @@
             <w:pPr>
               <w:pStyle w:val="Sinespaciado"/>
               <w:rPr>
+                <w:rFonts w:eastAsiaTheme="minorHAnsi" w:cstheme="minorHAnsi"/>
+                <w:lang w:eastAsia="en-US"/>
+              </w:rPr>
+            </w:pPr>
+            <w:r>
+              <w:rPr>
                 <w:rFonts w:ascii="Berlin Sans FB Demi" w:eastAsiaTheme="minorHAnsi" w:hAnsi="Berlin Sans FB Demi"/>
                 <w:lang w:eastAsia="en-US"/>
               </w:rPr>
-            </w:pPr>
+              <w:t>SABER:</w:t>
+            </w:r>
             <w:r>
               <w:rPr>
                 <w:rFonts w:ascii="Berlin Sans FB Demi" w:eastAsiaTheme="minorHAnsi" w:hAnsi="Berlin Sans FB Demi"/>
                 <w:lang w:eastAsia="en-US"/>
               </w:rPr>
-              <w:t>SABER:</w:t>
+              <w:t xml:space="preserve"> </w:t>
+            </w:r>
+            <w:r>
+              <w:rPr>
+                <w:rFonts w:eastAsiaTheme="minorHAnsi" w:cstheme="minorHAnsi"/>
+                <w:lang w:eastAsia="en-US"/>
+              </w:rPr>
+              <w:t>Analiza las normas de actuación en primeros auxilios.</w:t>
             </w:r>
           </w:p>
         </w:tc>
@@ -2322,16 +2565,30 @@
             <w:pPr>
               <w:pStyle w:val="Sinespaciado"/>
               <w:rPr>
+                <w:rFonts w:eastAsiaTheme="minorHAnsi" w:cstheme="minorHAnsi"/>
+                <w:lang w:eastAsia="en-US"/>
+              </w:rPr>
+            </w:pPr>
+            <w:r>
+              <w:rPr>
                 <w:rFonts w:ascii="Berlin Sans FB Demi" w:eastAsiaTheme="minorHAnsi" w:hAnsi="Berlin Sans FB Demi"/>
                 <w:lang w:eastAsia="en-US"/>
               </w:rPr>
-            </w:pPr>
+              <w:t>VALORACIÓN:</w:t>
+            </w:r>
             <w:r>
               <w:rPr>
                 <w:rFonts w:ascii="Berlin Sans FB Demi" w:eastAsiaTheme="minorHAnsi" w:hAnsi="Berlin Sans FB Demi"/>
                 <w:lang w:eastAsia="en-US"/>
               </w:rPr>
-              <w:t>VALORACIÓN:</w:t>
+              <w:t xml:space="preserve"> </w:t>
+            </w:r>
+            <w:r>
+              <w:rPr>
+                <w:rFonts w:eastAsiaTheme="minorHAnsi" w:cstheme="minorHAnsi"/>
+                <w:lang w:eastAsia="en-US"/>
+              </w:rPr>
+              <w:t>Valoramos la reacción oportuna ante una emergencia médica.</w:t>
             </w:r>
           </w:p>
         </w:tc>
@@ -2345,16 +2602,30 @@
             <w:pPr>
               <w:pStyle w:val="Sinespaciado"/>
               <w:rPr>
+                <w:rFonts w:eastAsiaTheme="minorHAnsi" w:cstheme="minorHAnsi"/>
+                <w:lang w:eastAsia="en-US"/>
+              </w:rPr>
+            </w:pPr>
+            <w:r>
+              <w:rPr>
                 <w:rFonts w:ascii="Berlin Sans FB Demi" w:eastAsiaTheme="minorHAnsi" w:hAnsi="Berlin Sans FB Demi"/>
                 <w:lang w:eastAsia="en-US"/>
               </w:rPr>
-            </w:pPr>
+              <w:t>HACER:</w:t>
+            </w:r>
             <w:r>
               <w:rPr>
                 <w:rFonts w:ascii="Berlin Sans FB Demi" w:eastAsiaTheme="minorHAnsi" w:hAnsi="Berlin Sans FB Demi"/>
                 <w:lang w:eastAsia="en-US"/>
               </w:rPr>
-              <w:t>HACER:</w:t>
+              <w:t xml:space="preserve"> </w:t>
+            </w:r>
+            <w:r>
+              <w:rPr>
+                <w:rFonts w:eastAsiaTheme="minorHAnsi" w:cstheme="minorHAnsi"/>
+                <w:lang w:eastAsia="en-US"/>
+              </w:rPr>
+              <w:t>Realiza un cuestionario y dramatización en primeros auxilios.</w:t>
             </w:r>
           </w:p>
         </w:tc>
@@ -2370,16 +2641,30 @@
             <w:pPr>
               <w:pStyle w:val="Sinespaciado"/>
               <w:rPr>
+                <w:rFonts w:eastAsiaTheme="minorHAnsi" w:cstheme="minorHAnsi"/>
+                <w:lang w:eastAsia="en-US"/>
+              </w:rPr>
+            </w:pPr>
+            <w:r>
+              <w:rPr>
                 <w:rFonts w:ascii="Berlin Sans FB Demi" w:eastAsiaTheme="minorHAnsi" w:hAnsi="Berlin Sans FB Demi"/>
                 <w:lang w:eastAsia="en-US"/>
               </w:rPr>
-            </w:pPr>
+              <w:t>PRODUCCIÓN:</w:t>
+            </w:r>
             <w:r>
               <w:rPr>
                 <w:rFonts w:ascii="Berlin Sans FB Demi" w:eastAsiaTheme="minorHAnsi" w:hAnsi="Berlin Sans FB Demi"/>
                 <w:lang w:eastAsia="en-US"/>
               </w:rPr>
-              <w:t>PRODUCCIÓN:</w:t>
+              <w:t xml:space="preserve"> </w:t>
+            </w:r>
+            <w:r>
+              <w:rPr>
+                <w:rFonts w:eastAsiaTheme="minorHAnsi" w:cstheme="minorHAnsi"/>
+                <w:lang w:eastAsia="en-US"/>
+              </w:rPr>
+              <w:t>Elaboramos un cuestionario sobre las normas de actuación en primeros auxilios</w:t>
             </w:r>
           </w:p>
         </w:tc>
@@ -2393,16 +2678,23 @@
             <w:pPr>
               <w:pStyle w:val="Sinespaciado"/>
               <w:rPr>
+                <w:rFonts w:ascii="Arial" w:eastAsiaTheme="minorHAnsi" w:hAnsi="Arial" w:cs="Arial"/>
+                <w:lang w:eastAsia="en-US"/>
+              </w:rPr>
+            </w:pPr>
+            <w:r>
+              <w:rPr>
                 <w:rFonts w:ascii="Berlin Sans FB Demi" w:eastAsiaTheme="minorHAnsi" w:hAnsi="Berlin Sans FB Demi"/>
                 <w:lang w:eastAsia="en-US"/>
               </w:rPr>
-            </w:pPr>
-            <w:r>
-              <w:rPr>
-                <w:rFonts w:ascii="Berlin Sans FB Demi" w:eastAsiaTheme="minorHAnsi" w:hAnsi="Berlin Sans FB Demi"/>
-                <w:lang w:eastAsia="en-US"/>
-              </w:rPr>
               <w:t xml:space="preserve">DECIDIR: </w:t>
+            </w:r>
+            <w:r>
+              <w:rPr>
+                <w:rFonts w:eastAsiaTheme="minorHAnsi" w:cstheme="minorHAnsi"/>
+                <w:lang w:eastAsia="en-US"/>
+              </w:rPr>
+              <w:t>Valora la actuación rápida y oportuna ante una emergencia médica.</w:t>
             </w:r>
           </w:p>
         </w:tc>
@@ -2695,10 +2987,35 @@
           </w:tcPr>
           <w:p>
             <w:pPr>
-              <w:pStyle w:val="Sinespaciado"/>
-            </w:pPr>
-            <w:r>
-              <w:t>Materiales físicos libros, revistas pedagógicas, etc. que se utilizan en el desarrollo curricular</w:t>
+              <w:spacing w:after="0" w:line="240" w:lineRule="auto"/>
+              <w:rPr>
+                <w:rFonts w:eastAsia="Times New Roman"/>
+                <w:lang w:eastAsia="es-419"/>
+              </w:rPr>
+            </w:pPr>
+            <w:r>
+              <w:rPr>
+                <w:rStyle w:val="fontstyle01"/>
+              </w:rPr>
+              <w:t>Marcadores, material oficina, texto</w:t>
+            </w:r>
+            <w:r>
+              <w:rPr>
+                <w:rStyle w:val="fontstyle01"/>
+              </w:rPr>
+              <w:t xml:space="preserve"> de apuntes</w:t>
+            </w:r>
+            <w:r>
+              <w:rPr>
+                <w:rStyle w:val="fontstyle01"/>
+              </w:rPr>
+              <w:t xml:space="preserve"> </w:t>
+            </w:r>
+            <w:r>
+              <w:rPr>
+                <w:rStyle w:val="fontstyle01"/>
+              </w:rPr>
+              <w:t>primeros auxilios.</w:t>
             </w:r>
           </w:p>
           <w:p>
@@ -2718,51 +3035,8 @@
               <w:pStyle w:val="Sinespaciado"/>
             </w:pPr>
             <w:r>
-              <w:t xml:space="preserve">Enlaces de videos, de herramientas virtuales como </w:t>
-            </w:r>
-            <w:proofErr w:type="spellStart"/>
-            <w:r>
-              <w:t>quizizz</w:t>
-            </w:r>
-            <w:proofErr w:type="spellEnd"/>
-            <w:r>
-              <w:t xml:space="preserve">, </w:t>
-            </w:r>
-            <w:proofErr w:type="spellStart"/>
-            <w:r>
-              <w:t>kahoot</w:t>
-            </w:r>
-            <w:proofErr w:type="spellEnd"/>
-            <w:r>
-              <w:t xml:space="preserve">, </w:t>
-            </w:r>
-            <w:proofErr w:type="spellStart"/>
-            <w:r>
-              <w:t>educaplay</w:t>
-            </w:r>
-            <w:proofErr w:type="spellEnd"/>
-            <w:r>
-              <w:t xml:space="preserve">, etc. – enlaces de páginas informativas </w:t>
-            </w:r>
-          </w:p>
-          <w:p>
-            <w:pPr>
-              <w:pStyle w:val="Sinespaciado"/>
-            </w:pPr>
-            <w:r>
-              <w:t xml:space="preserve">(los datos de internet – Google son muy generales y </w:t>
-            </w:r>
-            <w:r>
-              <w:t xml:space="preserve">son </w:t>
-            </w:r>
-            <w:r>
-              <w:t>buscadores)</w:t>
-            </w:r>
-          </w:p>
-          <w:p>
-            <w:pPr>
-              <w:pStyle w:val="Sinespaciado"/>
-            </w:pPr>
+              <w:t>Reproductor de video Android/Windows.</w:t>
+            </w:r>
           </w:p>
         </w:tc>
       </w:tr>
@@ -2852,7 +3126,23 @@
               <w:pStyle w:val="Sinespaciado"/>
             </w:pPr>
             <w:r>
-              <w:t xml:space="preserve">Se cita al autor y titulo de libros textos, revistas pedagógicas y enlaces de material virtual que se utilizara en los temas avanzados en el desarrollo curricular.  </w:t>
+              <w:t xml:space="preserve">BOSAI: Esté preparado - Primeros auxilios - Cruce cultural Culture Crossroads | NHK WORLD-JAPAN </w:t>
+            </w:r>
+            <w:hyperlink r:id="rId8" w:history="1">
+              <w:r>
+                <w:rPr>
+                  <w:rStyle w:val="Hipervnculo"/>
+                </w:rPr>
+                <w:t>https://is.gd/5EGQMs</w:t>
+              </w:r>
+            </w:hyperlink>
+          </w:p>
+          <w:p>
+            <w:pPr>
+              <w:pStyle w:val="Sinespaciado"/>
+            </w:pPr>
+            <w:r>
+              <w:t>Primeros Auxilios Asepeyo - CURSO DE FORMACIÓN EN PRIMEROS AUXILIOS Acreditada como - Studocu https://is.gd/CqTmAe</w:t>
             </w:r>
           </w:p>
         </w:tc>
@@ -2905,6 +3195,7 @@
           <w:szCs w:val="32"/>
           <w:lang w:val="es-BO" w:eastAsia="en-US"/>
         </w:rPr>
+        <w:lastRenderedPageBreak/>
         <mc:AlternateContent>
           <mc:Choice Requires="wps">
             <w:drawing>
@@ -3051,8 +3342,8 @@
       </w:r>
     </w:p>
     <w:sectPr>
-      <w:headerReference w:type="default" r:id="rId8"/>
-      <w:footerReference w:type="default" r:id="rId9"/>
+      <w:headerReference w:type="default" r:id="rId9"/>
+      <w:footerReference w:type="default" r:id="rId10"/>
       <w:pgSz w:w="15842" w:h="12242" w:orient="landscape" w:code="1"/>
       <w:pgMar w:top="1134" w:right="1134" w:bottom="1134" w:left="1134" w:header="709" w:footer="709" w:gutter="0"/>
       <w:cols w:space="708"/>
@@ -3737,11 +4028,127 @@
       </w:rPr>
     </w:lvl>
   </w:abstractNum>
+  <w:abstractNum w:abstractNumId="2" w15:restartNumberingAfterBreak="0">
+    <w:nsid w:val="53E06CE7"/>
+    <w:multiLevelType w:val="multilevel"/>
+    <w:tmpl w:val="53A42D8E"/>
+    <w:lvl w:ilvl="0">
+      <w:start w:val="1"/>
+      <w:numFmt w:val="bullet"/>
+      <w:lvlText w:val="●"/>
+      <w:lvlJc w:val="left"/>
+      <w:pPr>
+        <w:ind w:left="720" w:hanging="360"/>
+      </w:pPr>
+      <w:rPr>
+        <w:u w:val="none"/>
+      </w:rPr>
+    </w:lvl>
+    <w:lvl w:ilvl="1">
+      <w:start w:val="1"/>
+      <w:numFmt w:val="lowerLetter"/>
+      <w:lvlText w:val="%2."/>
+      <w:lvlJc w:val="left"/>
+      <w:pPr>
+        <w:ind w:left="1440" w:hanging="360"/>
+      </w:pPr>
+      <w:rPr>
+        <w:u w:val="none"/>
+      </w:rPr>
+    </w:lvl>
+    <w:lvl w:ilvl="2">
+      <w:start w:val="1"/>
+      <w:numFmt w:val="lowerRoman"/>
+      <w:lvlText w:val="%3."/>
+      <w:lvlJc w:val="right"/>
+      <w:pPr>
+        <w:ind w:left="2160" w:hanging="360"/>
+      </w:pPr>
+      <w:rPr>
+        <w:u w:val="none"/>
+      </w:rPr>
+    </w:lvl>
+    <w:lvl w:ilvl="3">
+      <w:start w:val="1"/>
+      <w:numFmt w:val="decimal"/>
+      <w:lvlText w:val="%4."/>
+      <w:lvlJc w:val="left"/>
+      <w:pPr>
+        <w:ind w:left="2880" w:hanging="360"/>
+      </w:pPr>
+      <w:rPr>
+        <w:u w:val="none"/>
+      </w:rPr>
+    </w:lvl>
+    <w:lvl w:ilvl="4">
+      <w:start w:val="1"/>
+      <w:numFmt w:val="lowerLetter"/>
+      <w:lvlText w:val="%5."/>
+      <w:lvlJc w:val="left"/>
+      <w:pPr>
+        <w:ind w:left="3600" w:hanging="360"/>
+      </w:pPr>
+      <w:rPr>
+        <w:u w:val="none"/>
+      </w:rPr>
+    </w:lvl>
+    <w:lvl w:ilvl="5">
+      <w:start w:val="1"/>
+      <w:numFmt w:val="lowerRoman"/>
+      <w:lvlText w:val="%6."/>
+      <w:lvlJc w:val="right"/>
+      <w:pPr>
+        <w:ind w:left="4320" w:hanging="360"/>
+      </w:pPr>
+      <w:rPr>
+        <w:u w:val="none"/>
+      </w:rPr>
+    </w:lvl>
+    <w:lvl w:ilvl="6">
+      <w:start w:val="1"/>
+      <w:numFmt w:val="decimal"/>
+      <w:lvlText w:val="%7."/>
+      <w:lvlJc w:val="left"/>
+      <w:pPr>
+        <w:ind w:left="5040" w:hanging="360"/>
+      </w:pPr>
+      <w:rPr>
+        <w:u w:val="none"/>
+      </w:rPr>
+    </w:lvl>
+    <w:lvl w:ilvl="7">
+      <w:start w:val="1"/>
+      <w:numFmt w:val="lowerLetter"/>
+      <w:lvlText w:val="%8."/>
+      <w:lvlJc w:val="left"/>
+      <w:pPr>
+        <w:ind w:left="5760" w:hanging="360"/>
+      </w:pPr>
+      <w:rPr>
+        <w:u w:val="none"/>
+      </w:rPr>
+    </w:lvl>
+    <w:lvl w:ilvl="8">
+      <w:start w:val="1"/>
+      <w:numFmt w:val="lowerRoman"/>
+      <w:lvlText w:val="%9."/>
+      <w:lvlJc w:val="right"/>
+      <w:pPr>
+        <w:ind w:left="6480" w:hanging="360"/>
+      </w:pPr>
+      <w:rPr>
+        <w:u w:val="none"/>
+      </w:rPr>
+    </w:lvl>
+  </w:abstractNum>
   <w:num w:numId="1" w16cid:durableId="1164781861">
     <w:abstractNumId w:val="0"/>
   </w:num>
   <w:num w:numId="2" w16cid:durableId="1520974456">
     <w:abstractNumId w:val="1"/>
+  </w:num>
+  <w:num w:numId="3" w16cid:durableId="1860313281">
+    <w:abstractNumId w:val="2"/>
   </w:num>
 </w:numbering>
 </file>
@@ -4317,6 +4724,44 @@
     <w:locked/>
     <w:rsid w:val="00046389"/>
   </w:style>
+  <w:style w:type="character" w:customStyle="1" w:styleId="fontstyle01">
+    <w:name w:val="fontstyle01"/>
+    <w:basedOn w:val="Fuentedeprrafopredeter"/>
+    <w:rsid w:val="00993532"/>
+    <w:rPr>
+      <w:rFonts w:ascii="Calibri" w:hAnsi="Calibri" w:cs="Calibri" w:hint="default"/>
+      <w:b w:val="0"/>
+      <w:bCs w:val="0"/>
+      <w:i w:val="0"/>
+      <w:iCs w:val="0"/>
+      <w:color w:val="000000"/>
+      <w:sz w:val="22"/>
+      <w:szCs w:val="22"/>
+    </w:rPr>
+  </w:style>
+  <w:style w:type="character" w:styleId="Hipervnculo">
+    <w:name w:val="Hyperlink"/>
+    <w:basedOn w:val="Fuentedeprrafopredeter"/>
+    <w:uiPriority w:val="99"/>
+    <w:unhideWhenUsed/>
+    <w:rsid w:val="009C73A4"/>
+    <w:rPr>
+      <w:color w:val="0563C1" w:themeColor="hyperlink"/>
+      <w:u w:val="single"/>
+    </w:rPr>
+  </w:style>
+  <w:style w:type="character" w:styleId="Mencinsinresolver">
+    <w:name w:val="Unresolved Mention"/>
+    <w:basedOn w:val="Fuentedeprrafopredeter"/>
+    <w:uiPriority w:val="99"/>
+    <w:semiHidden/>
+    <w:unhideWhenUsed/>
+    <w:rsid w:val="009C73A4"/>
+    <w:rPr>
+      <w:color w:val="605E5C"/>
+      <w:shd w:val="clear" w:color="auto" w:fill="E1DFDD"/>
+    </w:rPr>
+  </w:style>
 </w:styles>
 </file>
 

</xml_diff>